<commit_message>
Refactor prompt naming and clean repository
</commit_message>
<xml_diff>
--- a/evaluation/AnxioSense_Experimental_Setup.docx
+++ b/evaluation/AnxioSense_Experimental_Setup.docx
@@ -1431,7 +1431,7 @@
           <w:sz w:val="22"/>
           <w:szCs w:val="22"/>
         </w:rPr>
-        <w:t xml:space="preserve">Two datasets are used in the primary evaluation. Both are sourced from Reddit, are compatible with the AnxioSense social media screening mode, and are published in top-tier venues. Their different label types (stress proxy vs. self-reported diagnosis) add methodological diversity.</w:t>
+        <w:t xml:space="preserve">Two datasets are used in the primary evaluation. Both are drawn from Reddit and are compatible with the AnxioSense social media screening mode. Dreaddit provides end-to-end stress and anxiety detection labels; GoEmotions provides fine-grained emotion labels that align with the Emotion Analysis Agent output schema. Both are published in peer-reviewed venues.</w:t>
       </w:r>
     </w:p>
     <w:p>
@@ -1458,30 +1458,24 @@
         </w:tblCellMar>
       </w:tblPr>
       <w:tblGrid>
-        <w:gridCol w:w="1900"/>
-        <w:gridCol w:w="2900"/>
-        <w:gridCol w:w="3120"/>
+        <w:gridCol w:w="2000"/>
+        <w:gridCol w:w="3460"/>
+        <w:gridCol w:w="3460"/>
       </w:tblGrid>
       <w:tr>
-        <w:trPr>
-          <w:tblHeader/>
-        </w:trPr>
-        <w:tc>
-          <w:tcPr>
-            <w:tcW w:type="dxa" w:w="1900"/>
+        <w:tc>
+          <w:tcPr>
+            <w:tcW w:type="dxa" w:w="2000"/>
             <w:shd w:fill="D9E1F2" w:color="auto" w:val="clear"/>
           </w:tcPr>
           <w:p>
-            <w:pPr>
-              <w:jc w:val="center"/>
-            </w:pPr>
             <w:r>
               <w:rPr>
                 <w:rFonts w:ascii="Times New Roman" w:cs="Times New Roman" w:eastAsia="Times New Roman" w:hAnsi="Times New Roman"/>
                 <w:b/>
                 <w:bCs/>
-                <w:sz w:val="19"/>
-                <w:szCs w:val="19"/>
+                <w:sz w:val="18"/>
+                <w:szCs w:val="18"/>
               </w:rPr>
               <w:t xml:space="preserve">Property</w:t>
             </w:r>
@@ -1489,20 +1483,17 @@
         </w:tc>
         <w:tc>
           <w:tcPr>
-            <w:tcW w:type="dxa" w:w="2900"/>
+            <w:tcW w:type="dxa" w:w="3460"/>
             <w:shd w:fill="D9E1F2" w:color="auto" w:val="clear"/>
           </w:tcPr>
           <w:p>
-            <w:pPr>
-              <w:jc w:val="center"/>
-            </w:pPr>
             <w:r>
               <w:rPr>
                 <w:rFonts w:ascii="Times New Roman" w:cs="Times New Roman" w:eastAsia="Times New Roman" w:hAnsi="Times New Roman"/>
                 <w:b/>
                 <w:bCs/>
-                <w:sz w:val="19"/>
-                <w:szCs w:val="19"/>
+                <w:sz w:val="18"/>
+                <w:szCs w:val="18"/>
               </w:rPr>
               <w:t xml:space="preserve">Dataset 1 — Dreaddit</w:t>
             </w:r>
@@ -1510,46 +1501,45 @@
         </w:tc>
         <w:tc>
           <w:tcPr>
-            <w:tcW w:type="dxa" w:w="3120"/>
+            <w:tcW w:type="dxa" w:w="3460"/>
             <w:shd w:fill="D9E1F2" w:color="auto" w:val="clear"/>
           </w:tcPr>
           <w:p>
-            <w:pPr>
-              <w:jc w:val="center"/>
-            </w:pPr>
             <w:r>
               <w:rPr>
                 <w:rFonts w:ascii="Times New Roman" w:cs="Times New Roman" w:eastAsia="Times New Roman" w:hAnsi="Times New Roman"/>
                 <w:b/>
                 <w:bCs/>
-                <w:sz w:val="19"/>
-                <w:szCs w:val="19"/>
-              </w:rPr>
-              <w:t xml:space="preserve">Dataset 2 — ANGST</w:t>
-            </w:r>
-          </w:p>
-        </w:tc>
-      </w:tr>
-      <w:tr>
-        <w:tc>
-          <w:tcPr>
-            <w:tcW w:type="dxa" w:w="1900"/>
-            <w:shd w:fill="FFFFFF" w:color="auto" w:val="clear"/>
-          </w:tcPr>
-          <w:p>
-            <w:r>
-              <w:rPr>
-                <w:rFonts w:ascii="Times New Roman" w:cs="Times New Roman" w:eastAsia="Times New Roman" w:hAnsi="Times New Roman"/>
-                <w:sz w:val="18"/>
-                <w:szCs w:val="18"/>
-              </w:rPr>
-              <w:t xml:space="preserve">Full name</w:t>
-            </w:r>
-          </w:p>
-        </w:tc>
-        <w:tc>
-          <w:tcPr>
-            <w:tcW w:type="dxa" w:w="2900"/>
+                <w:sz w:val="18"/>
+                <w:szCs w:val="18"/>
+              </w:rPr>
+              <w:t xml:space="preserve">Dataset 2 — GoEmotions</w:t>
+            </w:r>
+          </w:p>
+        </w:tc>
+      </w:tr>
+      <w:tr>
+        <w:tc>
+          <w:tcPr>
+            <w:tcW w:type="dxa" w:w="2000"/>
+            <w:shd w:fill="F2F2F2" w:color="auto" w:val="clear"/>
+          </w:tcPr>
+          <w:p>
+            <w:r>
+              <w:rPr>
+                <w:rFonts w:ascii="Times New Roman" w:cs="Times New Roman" w:eastAsia="Times New Roman" w:hAnsi="Times New Roman"/>
+                <w:b/>
+                <w:bCs/>
+                <w:sz w:val="18"/>
+                <w:szCs w:val="18"/>
+              </w:rPr>
+              <w:t xml:space="preserve">Dataset</w:t>
+            </w:r>
+          </w:p>
+        </w:tc>
+        <w:tc>
+          <w:tcPr>
+            <w:tcW w:type="dxa" w:w="3460"/>
             <w:shd w:fill="FFFFFF" w:color="auto" w:val="clear"/>
           </w:tcPr>
           <w:p>
@@ -1565,417 +1555,277 @@
         </w:tc>
         <w:tc>
           <w:tcPr>
-            <w:tcW w:type="dxa" w:w="3120"/>
-            <w:shd w:fill="FFFFFF" w:color="auto" w:val="clear"/>
-          </w:tcPr>
-          <w:p>
-            <w:r>
-              <w:rPr>
-                <w:rFonts w:ascii="Times New Roman" w:cs="Times New Roman" w:eastAsia="Times New Roman" w:hAnsi="Times New Roman"/>
-                <w:sz w:val="18"/>
-                <w:szCs w:val="18"/>
-              </w:rPr>
-              <w:t xml:space="preserve">ANGST: A Dataset for Anxiety and Stress Analysis</w:t>
-            </w:r>
-          </w:p>
-        </w:tc>
-      </w:tr>
-      <w:tr>
-        <w:tc>
-          <w:tcPr>
-            <w:tcW w:type="dxa" w:w="1900"/>
-            <w:shd w:fill="F2F2F2" w:color="auto" w:val="clear"/>
-          </w:tcPr>
-          <w:p>
-            <w:r>
-              <w:rPr>
-                <w:rFonts w:ascii="Times New Roman" w:cs="Times New Roman" w:eastAsia="Times New Roman" w:hAnsi="Times New Roman"/>
-                <w:sz w:val="18"/>
-                <w:szCs w:val="18"/>
-              </w:rPr>
-              <w:t xml:space="preserve">Citation</w:t>
-            </w:r>
-          </w:p>
-        </w:tc>
-        <w:tc>
-          <w:tcPr>
-            <w:tcW w:type="dxa" w:w="2900"/>
-            <w:shd w:fill="F2F2F2" w:color="auto" w:val="clear"/>
-          </w:tcPr>
-          <w:p>
-            <w:r>
-              <w:rPr>
-                <w:rFonts w:ascii="Times New Roman" w:cs="Times New Roman" w:eastAsia="Times New Roman" w:hAnsi="Times New Roman"/>
-                <w:sz w:val="18"/>
-                <w:szCs w:val="18"/>
-              </w:rPr>
-              <w:t xml:space="preserve">Turcan &amp; McKeown, 2019</w:t>
-            </w:r>
-          </w:p>
-        </w:tc>
-        <w:tc>
-          <w:tcPr>
-            <w:tcW w:type="dxa" w:w="3120"/>
-            <w:shd w:fill="F2F2F2" w:color="auto" w:val="clear"/>
-          </w:tcPr>
-          <w:p>
-            <w:r>
-              <w:rPr>
-                <w:rFonts w:ascii="Times New Roman" w:cs="Times New Roman" w:eastAsia="Times New Roman" w:hAnsi="Times New Roman"/>
-                <w:sz w:val="18"/>
-                <w:szCs w:val="18"/>
-              </w:rPr>
-              <w:t xml:space="preserve">Hengle et al., 2024</w:t>
-            </w:r>
-          </w:p>
-        </w:tc>
-      </w:tr>
-      <w:tr>
-        <w:tc>
-          <w:tcPr>
-            <w:tcW w:type="dxa" w:w="1900"/>
-            <w:shd w:fill="FFFFFF" w:color="auto" w:val="clear"/>
-          </w:tcPr>
-          <w:p>
-            <w:r>
-              <w:rPr>
-                <w:rFonts w:ascii="Times New Roman" w:cs="Times New Roman" w:eastAsia="Times New Roman" w:hAnsi="Times New Roman"/>
-                <w:sz w:val="18"/>
-                <w:szCs w:val="18"/>
-              </w:rPr>
-              <w:t xml:space="preserve">Venue</w:t>
-            </w:r>
-          </w:p>
-        </w:tc>
-        <w:tc>
-          <w:tcPr>
-            <w:tcW w:type="dxa" w:w="2900"/>
-            <w:shd w:fill="FFFFFF" w:color="auto" w:val="clear"/>
-          </w:tcPr>
-          <w:p>
-            <w:r>
-              <w:rPr>
-                <w:rFonts w:ascii="Times New Roman" w:cs="Times New Roman" w:eastAsia="Times New Roman" w:hAnsi="Times New Roman"/>
-                <w:sz w:val="18"/>
-                <w:szCs w:val="18"/>
-              </w:rPr>
-              <w:t xml:space="preserve">CLPsych 2019, co-located with NAACL-HLT 2019</w:t>
-            </w:r>
-          </w:p>
-        </w:tc>
-        <w:tc>
-          <w:tcPr>
-            <w:tcW w:type="dxa" w:w="3120"/>
-            <w:shd w:fill="FFFFFF" w:color="auto" w:val="clear"/>
-          </w:tcPr>
-          <w:p>
-            <w:r>
-              <w:rPr>
-                <w:rFonts w:ascii="Times New Roman" w:cs="Times New Roman" w:eastAsia="Times New Roman" w:hAnsi="Times New Roman"/>
-                <w:sz w:val="18"/>
-                <w:szCs w:val="18"/>
-              </w:rPr>
-              <w:t xml:space="preserve">EMNLP 2024 (main conference)</w:t>
-            </w:r>
-          </w:p>
-        </w:tc>
-      </w:tr>
-      <w:tr>
-        <w:tc>
-          <w:tcPr>
-            <w:tcW w:type="dxa" w:w="1900"/>
-            <w:shd w:fill="F2F2F2" w:color="auto" w:val="clear"/>
-          </w:tcPr>
-          <w:p>
-            <w:r>
-              <w:rPr>
-                <w:rFonts w:ascii="Times New Roman" w:cs="Times New Roman" w:eastAsia="Times New Roman" w:hAnsi="Times New Roman"/>
-                <w:sz w:val="18"/>
-                <w:szCs w:val="18"/>
-              </w:rPr>
-              <w:t xml:space="preserve">Size used</w:t>
-            </w:r>
-          </w:p>
-        </w:tc>
-        <w:tc>
-          <w:tcPr>
-            <w:tcW w:type="dxa" w:w="2900"/>
-            <w:shd w:fill="F2F2F2" w:color="auto" w:val="clear"/>
-          </w:tcPr>
-          <w:p>
-            <w:r>
-              <w:rPr>
-                <w:rFonts w:ascii="Times New Roman" w:cs="Times New Roman" w:eastAsia="Times New Roman" w:hAnsi="Times New Roman"/>
-                <w:sz w:val="18"/>
-                <w:szCs w:val="18"/>
-              </w:rPr>
-              <w:t xml:space="preserve">3,553 Reddit posts across 5 subreddits</w:t>
-            </w:r>
-          </w:p>
-        </w:tc>
-        <w:tc>
-          <w:tcPr>
-            <w:tcW w:type="dxa" w:w="3120"/>
-            <w:shd w:fill="F2F2F2" w:color="auto" w:val="clear"/>
-          </w:tcPr>
-          <w:p>
-            <w:r>
-              <w:rPr>
-                <w:rFonts w:ascii="Times New Roman" w:cs="Times New Roman" w:eastAsia="Times New Roman" w:hAnsi="Times New Roman"/>
-                <w:sz w:val="18"/>
-                <w:szCs w:val="18"/>
-              </w:rPr>
-              <w:t xml:space="preserve">2,876 psychologist-annotated posts + 7,667 silver-standard posts</w:t>
-            </w:r>
-          </w:p>
-        </w:tc>
-      </w:tr>
-      <w:tr>
-        <w:tc>
-          <w:tcPr>
-            <w:tcW w:type="dxa" w:w="1900"/>
-            <w:shd w:fill="FFFFFF" w:color="auto" w:val="clear"/>
-          </w:tcPr>
-          <w:p>
-            <w:r>
-              <w:rPr>
-                <w:rFonts w:ascii="Times New Roman" w:cs="Times New Roman" w:eastAsia="Times New Roman" w:hAnsi="Times New Roman"/>
-                <w:sz w:val="18"/>
-                <w:szCs w:val="18"/>
-              </w:rPr>
-              <w:t xml:space="preserve">Ground-truth labels</w:t>
-            </w:r>
-          </w:p>
-        </w:tc>
-        <w:tc>
-          <w:tcPr>
-            <w:tcW w:type="dxa" w:w="2900"/>
-            <w:shd w:fill="FFFFFF" w:color="auto" w:val="clear"/>
-          </w:tcPr>
-          <w:p>
-            <w:r>
-              <w:rPr>
-                <w:rFonts w:ascii="Times New Roman" w:cs="Times New Roman" w:eastAsia="Times New Roman" w:hAnsi="Times New Roman"/>
-                <w:sz w:val="18"/>
-                <w:szCs w:val="18"/>
-              </w:rPr>
-              <w:t xml:space="preserve">Binary: stressed / not stressed</w:t>
-            </w:r>
-          </w:p>
-        </w:tc>
-        <w:tc>
-          <w:tcPr>
-            <w:tcW w:type="dxa" w:w="3120"/>
-            <w:shd w:fill="FFFFFF" w:color="auto" w:val="clear"/>
-          </w:tcPr>
-          <w:p>
-            <w:r>
-              <w:rPr>
-                <w:rFonts w:ascii="Times New Roman" w:cs="Times New Roman" w:eastAsia="Times New Roman" w:hAnsi="Times New Roman"/>
-                <w:sz w:val="18"/>
-                <w:szCs w:val="18"/>
-              </w:rPr>
-              <w:t xml:space="preserve">Anxiety / depression / both / neither (psychologist-annotated)</w:t>
-            </w:r>
-          </w:p>
-        </w:tc>
-      </w:tr>
-      <w:tr>
-        <w:tc>
-          <w:tcPr>
-            <w:tcW w:type="dxa" w:w="1900"/>
-            <w:shd w:fill="F2F2F2" w:color="auto" w:val="clear"/>
-          </w:tcPr>
-          <w:p>
-            <w:r>
-              <w:rPr>
-                <w:rFonts w:ascii="Times New Roman" w:cs="Times New Roman" w:eastAsia="Times New Roman" w:hAnsi="Times New Roman"/>
-                <w:sz w:val="18"/>
-                <w:szCs w:val="18"/>
-              </w:rPr>
-              <w:t xml:space="preserve">Input mode</w:t>
-            </w:r>
-          </w:p>
-        </w:tc>
-        <w:tc>
-          <w:tcPr>
-            <w:tcW w:type="dxa" w:w="2900"/>
-            <w:shd w:fill="F2F2F2" w:color="auto" w:val="clear"/>
-          </w:tcPr>
-          <w:p>
-            <w:r>
-              <w:rPr>
-                <w:rFonts w:ascii="Times New Roman" w:cs="Times New Roman" w:eastAsia="Times New Roman" w:hAnsi="Times New Roman"/>
-                <w:sz w:val="18"/>
-                <w:szCs w:val="18"/>
-              </w:rPr>
-              <w:t xml:space="preserve">Social media mode</w:t>
-            </w:r>
-          </w:p>
-        </w:tc>
-        <w:tc>
-          <w:tcPr>
-            <w:tcW w:type="dxa" w:w="3120"/>
-            <w:shd w:fill="F2F2F2" w:color="auto" w:val="clear"/>
-          </w:tcPr>
-          <w:p>
-            <w:r>
-              <w:rPr>
-                <w:rFonts w:ascii="Times New Roman" w:cs="Times New Roman" w:eastAsia="Times New Roman" w:hAnsi="Times New Roman"/>
-                <w:sz w:val="18"/>
-                <w:szCs w:val="18"/>
-              </w:rPr>
-              <w:t xml:space="preserve">Social media mode</w:t>
-            </w:r>
-          </w:p>
-        </w:tc>
-      </w:tr>
-      <w:tr>
-        <w:tc>
-          <w:tcPr>
-            <w:tcW w:type="dxa" w:w="1900"/>
-            <w:shd w:fill="FFFFFF" w:color="auto" w:val="clear"/>
-          </w:tcPr>
-          <w:p>
-            <w:r>
-              <w:rPr>
-                <w:rFonts w:ascii="Times New Roman" w:cs="Times New Roman" w:eastAsia="Times New Roman" w:hAnsi="Times New Roman"/>
-                <w:sz w:val="18"/>
-                <w:szCs w:val="18"/>
-              </w:rPr>
-              <w:t xml:space="preserve">Access</w:t>
-            </w:r>
-          </w:p>
-        </w:tc>
-        <w:tc>
-          <w:tcPr>
-            <w:tcW w:type="dxa" w:w="2900"/>
-            <w:shd w:fill="FFFFFF" w:color="auto" w:val="clear"/>
-          </w:tcPr>
-          <w:p>
-            <w:r>
-              <w:rPr>
-                <w:rFonts w:ascii="Times New Roman" w:cs="Times New Roman" w:eastAsia="Times New Roman" w:hAnsi="Times New Roman"/>
-                <w:sz w:val="18"/>
-                <w:szCs w:val="18"/>
-              </w:rPr>
-              <w:t xml:space="preserve">HuggingFace (andreagasparini/dreaddit); already downloaded</w:t>
-            </w:r>
-          </w:p>
-        </w:tc>
-        <w:tc>
-          <w:tcPr>
-            <w:tcW w:type="dxa" w:w="3120"/>
-            <w:shd w:fill="FFFFFF" w:color="auto" w:val="clear"/>
-          </w:tcPr>
-          <w:p>
-            <w:r>
-              <w:rPr>
-                <w:rFonts w:ascii="Times New Roman" w:cs="Times New Roman" w:eastAsia="Times New Roman" w:hAnsi="Times New Roman"/>
-                <w:sz w:val="18"/>
-                <w:szCs w:val="18"/>
-              </w:rPr>
-              <w:t xml:space="preserve">HuggingFace (ameyhengle/ANGST); requires Google Form approval</w:t>
-            </w:r>
-          </w:p>
-        </w:tc>
-      </w:tr>
-      <w:tr>
-        <w:tc>
-          <w:tcPr>
-            <w:tcW w:type="dxa" w:w="1900"/>
-            <w:shd w:fill="F2F2F2" w:color="auto" w:val="clear"/>
-          </w:tcPr>
-          <w:p>
-            <w:r>
-              <w:rPr>
-                <w:rFonts w:ascii="Times New Roman" w:cs="Times New Roman" w:eastAsia="Times New Roman" w:hAnsi="Times New Roman"/>
-                <w:sz w:val="18"/>
-                <w:szCs w:val="18"/>
-              </w:rPr>
-              <w:t xml:space="preserve">Primary use</w:t>
-            </w:r>
-          </w:p>
-        </w:tc>
-        <w:tc>
-          <w:tcPr>
-            <w:tcW w:type="dxa" w:w="2900"/>
-            <w:shd w:fill="F2F2F2" w:color="auto" w:val="clear"/>
-          </w:tcPr>
-          <w:p>
-            <w:r>
-              <w:rPr>
-                <w:rFonts w:ascii="Times New Roman" w:cs="Times New Roman" w:eastAsia="Times New Roman" w:hAnsi="Times New Roman"/>
-                <w:sz w:val="18"/>
-                <w:szCs w:val="18"/>
-              </w:rPr>
-              <w:t xml:space="preserve">End-to-end referral level comparison across LLMs and strategies</w:t>
-            </w:r>
-          </w:p>
-        </w:tc>
-        <w:tc>
-          <w:tcPr>
-            <w:tcW w:type="dxa" w:w="3120"/>
-            <w:shd w:fill="F2F2F2" w:color="auto" w:val="clear"/>
-          </w:tcPr>
-          <w:p>
-            <w:r>
-              <w:rPr>
-                <w:rFonts w:ascii="Times New Roman" w:cs="Times New Roman" w:eastAsia="Times New Roman" w:hAnsi="Times New Roman"/>
-                <w:sz w:val="18"/>
-                <w:szCs w:val="18"/>
-              </w:rPr>
-              <w:t xml:space="preserve">Anxiety-specific evaluation with psychologist-validated labels; complements Dreaddit’s stress-proxy labels</w:t>
-            </w:r>
-          </w:p>
-        </w:tc>
-      </w:tr>
-      <w:tr>
-        <w:tc>
-          <w:tcPr>
-            <w:tcW w:type="dxa" w:w="1900"/>
-            <w:shd w:fill="FFFFFF" w:color="auto" w:val="clear"/>
-          </w:tcPr>
-          <w:p>
-            <w:r>
-              <w:rPr>
-                <w:rFonts w:ascii="Times New Roman" w:cs="Times New Roman" w:eastAsia="Times New Roman" w:hAnsi="Times New Roman"/>
-                <w:sz w:val="18"/>
-                <w:szCs w:val="18"/>
-              </w:rPr>
-              <w:t xml:space="preserve">Limitation</w:t>
-            </w:r>
-          </w:p>
-        </w:tc>
-        <w:tc>
-          <w:tcPr>
-            <w:tcW w:type="dxa" w:w="2900"/>
-            <w:shd w:fill="FFFFFF" w:color="auto" w:val="clear"/>
-          </w:tcPr>
-          <w:p>
-            <w:r>
-              <w:rPr>
-                <w:rFonts w:ascii="Times New Roman" w:cs="Times New Roman" w:eastAsia="Times New Roman" w:hAnsi="Times New Roman"/>
-                <w:sz w:val="18"/>
-                <w:szCs w:val="18"/>
-              </w:rPr>
-              <w:t xml:space="preserve">"Stress" label is a proxy for anxiety, not a clinical anxiety measure</w:t>
-            </w:r>
-          </w:p>
-        </w:tc>
-        <w:tc>
-          <w:tcPr>
-            <w:tcW w:type="dxa" w:w="3120"/>
-            <w:shd w:fill="FFFFFF" w:color="auto" w:val="clear"/>
-          </w:tcPr>
-          <w:p>
-            <w:r>
-              <w:rPr>
-                <w:rFonts w:ascii="Times New Roman" w:cs="Times New Roman" w:eastAsia="Times New Roman" w:hAnsi="Times New Roman"/>
-                <w:sz w:val="18"/>
-                <w:szCs w:val="18"/>
-              </w:rPr>
-              <w:t xml:space="preserve">Psychologist annotations are binary per post; silver-standard posts rely on distant supervision</w:t>
+            <w:tcW w:type="dxa" w:w="3460"/>
+            <w:shd w:fill="FFFFFF" w:color="auto" w:val="clear"/>
+          </w:tcPr>
+          <w:p>
+            <w:r>
+              <w:rPr>
+                <w:rFonts w:ascii="Times New Roman" w:cs="Times New Roman" w:eastAsia="Times New Roman" w:hAnsi="Times New Roman"/>
+                <w:sz w:val="18"/>
+                <w:szCs w:val="18"/>
+              </w:rPr>
+              <w:t xml:space="preserve">GoEmotions: A Dataset of Fine-Grained Emotions</w:t>
+            </w:r>
+          </w:p>
+        </w:tc>
+      </w:tr>
+      <w:tr>
+        <w:tc>
+          <w:tcPr>
+            <w:tcW w:type="dxa" w:w="2000"/>
+            <w:shd w:fill="F2F2F2" w:color="auto" w:val="clear"/>
+          </w:tcPr>
+          <w:p>
+            <w:r>
+              <w:rPr>
+                <w:rFonts w:ascii="Times New Roman" w:cs="Times New Roman" w:eastAsia="Times New Roman" w:hAnsi="Times New Roman"/>
+                <w:b/>
+                <w:bCs/>
+                <w:sz w:val="18"/>
+                <w:szCs w:val="18"/>
+              </w:rPr>
+              <w:t xml:space="preserve">Purpose in AnxioSense</w:t>
+            </w:r>
+          </w:p>
+        </w:tc>
+        <w:tc>
+          <w:tcPr>
+            <w:tcW w:type="dxa" w:w="3460"/>
+            <w:shd w:fill="FFFFFF" w:color="auto" w:val="clear"/>
+          </w:tcPr>
+          <w:p>
+            <w:r>
+              <w:rPr>
+                <w:rFonts w:ascii="Times New Roman" w:cs="Times New Roman" w:eastAsia="Times New Roman" w:hAnsi="Times New Roman"/>
+                <w:sz w:val="18"/>
+                <w:szCs w:val="18"/>
+              </w:rPr>
+              <w:t xml:space="preserve">Benchmark for end-to-end stress/anxiety detection and referral level classification</w:t>
+            </w:r>
+          </w:p>
+        </w:tc>
+        <w:tc>
+          <w:tcPr>
+            <w:tcW w:type="dxa" w:w="3460"/>
+            <w:shd w:fill="FFFFFF" w:color="auto" w:val="clear"/>
+          </w:tcPr>
+          <w:p>
+            <w:r>
+              <w:rPr>
+                <w:rFonts w:ascii="Times New Roman" w:cs="Times New Roman" w:eastAsia="Times New Roman" w:hAnsi="Times New Roman"/>
+                <w:sz w:val="18"/>
+                <w:szCs w:val="18"/>
+              </w:rPr>
+              <w:t xml:space="preserve">Benchmark for Emotion Analysis Agent; fine-grained emotion recognition from social media text</w:t>
+            </w:r>
+          </w:p>
+        </w:tc>
+      </w:tr>
+      <w:tr>
+        <w:tc>
+          <w:tcPr>
+            <w:tcW w:type="dxa" w:w="2000"/>
+            <w:shd w:fill="F2F2F2" w:color="auto" w:val="clear"/>
+          </w:tcPr>
+          <w:p>
+            <w:r>
+              <w:rPr>
+                <w:rFonts w:ascii="Times New Roman" w:cs="Times New Roman" w:eastAsia="Times New Roman" w:hAnsi="Times New Roman"/>
+                <w:b/>
+                <w:bCs/>
+                <w:sz w:val="18"/>
+                <w:szCs w:val="18"/>
+              </w:rPr>
+              <w:t xml:space="preserve">Task</w:t>
+            </w:r>
+          </w:p>
+        </w:tc>
+        <w:tc>
+          <w:tcPr>
+            <w:tcW w:type="dxa" w:w="3460"/>
+            <w:shd w:fill="FFFFFF" w:color="auto" w:val="clear"/>
+          </w:tcPr>
+          <w:p>
+            <w:r>
+              <w:rPr>
+                <w:rFonts w:ascii="Times New Roman" w:cs="Times New Roman" w:eastAsia="Times New Roman" w:hAnsi="Times New Roman"/>
+                <w:sz w:val="18"/>
+                <w:szCs w:val="18"/>
+              </w:rPr>
+              <w:t xml:space="preserve">Binary stress classification (stressed / not stressed)</w:t>
+            </w:r>
+          </w:p>
+        </w:tc>
+        <w:tc>
+          <w:tcPr>
+            <w:tcW w:type="dxa" w:w="3460"/>
+            <w:shd w:fill="FFFFFF" w:color="auto" w:val="clear"/>
+          </w:tcPr>
+          <w:p>
+            <w:r>
+              <w:rPr>
+                <w:rFonts w:ascii="Times New Roman" w:cs="Times New Roman" w:eastAsia="Times New Roman" w:hAnsi="Times New Roman"/>
+                <w:sz w:val="18"/>
+                <w:szCs w:val="18"/>
+              </w:rPr>
+              <w:t xml:space="preserve">Multi-label fine-grained emotion classification (27 emotion categories + neutral)</w:t>
+            </w:r>
+          </w:p>
+        </w:tc>
+      </w:tr>
+      <w:tr>
+        <w:tc>
+          <w:tcPr>
+            <w:tcW w:type="dxa" w:w="2000"/>
+            <w:shd w:fill="F2F2F2" w:color="auto" w:val="clear"/>
+          </w:tcPr>
+          <w:p>
+            <w:r>
+              <w:rPr>
+                <w:rFonts w:ascii="Times New Roman" w:cs="Times New Roman" w:eastAsia="Times New Roman" w:hAnsi="Times New Roman"/>
+                <w:b/>
+                <w:bCs/>
+                <w:sz w:val="18"/>
+                <w:szCs w:val="18"/>
+              </w:rPr>
+              <w:t xml:space="preserve">Size</w:t>
+            </w:r>
+          </w:p>
+        </w:tc>
+        <w:tc>
+          <w:tcPr>
+            <w:tcW w:type="dxa" w:w="3460"/>
+            <w:shd w:fill="FFFFFF" w:color="auto" w:val="clear"/>
+          </w:tcPr>
+          <w:p>
+            <w:r>
+              <w:rPr>
+                <w:rFonts w:ascii="Times New Roman" w:cs="Times New Roman" w:eastAsia="Times New Roman" w:hAnsi="Times New Roman"/>
+                <w:sz w:val="18"/>
+                <w:szCs w:val="18"/>
+              </w:rPr>
+              <w:t xml:space="preserve">3,553 labeled segments from 190,000+ Reddit posts (Train: 2,838; Test: 715)</w:t>
+            </w:r>
+          </w:p>
+        </w:tc>
+        <w:tc>
+          <w:tcPr>
+            <w:tcW w:type="dxa" w:w="3460"/>
+            <w:shd w:fill="FFFFFF" w:color="auto" w:val="clear"/>
+          </w:tcPr>
+          <w:p>
+            <w:r>
+              <w:rPr>
+                <w:rFonts w:ascii="Times New Roman" w:cs="Times New Roman" w:eastAsia="Times New Roman" w:hAnsi="Times New Roman"/>
+                <w:sz w:val="18"/>
+                <w:szCs w:val="18"/>
+              </w:rPr>
+              <w:t xml:space="preserve">58,009 English Reddit comments; anxiety-relevant subset: 27,647 comments</w:t>
+            </w:r>
+          </w:p>
+        </w:tc>
+      </w:tr>
+      <w:tr>
+        <w:tc>
+          <w:tcPr>
+            <w:tcW w:type="dxa" w:w="2000"/>
+            <w:shd w:fill="F2F2F2" w:color="auto" w:val="clear"/>
+          </w:tcPr>
+          <w:p>
+            <w:r>
+              <w:rPr>
+                <w:rFonts w:ascii="Times New Roman" w:cs="Times New Roman" w:eastAsia="Times New Roman" w:hAnsi="Times New Roman"/>
+                <w:b/>
+                <w:bCs/>
+                <w:sz w:val="18"/>
+                <w:szCs w:val="18"/>
+              </w:rPr>
+              <w:t xml:space="preserve">Source</w:t>
+            </w:r>
+          </w:p>
+        </w:tc>
+        <w:tc>
+          <w:tcPr>
+            <w:tcW w:type="dxa" w:w="3460"/>
+            <w:shd w:fill="FFFFFF" w:color="auto" w:val="clear"/>
+          </w:tcPr>
+          <w:p>
+            <w:r>
+              <w:rPr>
+                <w:rFonts w:ascii="Times New Roman" w:cs="Times New Roman" w:eastAsia="Times New Roman" w:hAnsi="Times New Roman"/>
+                <w:sz w:val="18"/>
+                <w:szCs w:val="18"/>
+              </w:rPr>
+              <w:t xml:space="preserve">Turcan &amp; McKeown (2019), LOUHI Workshop @ EMNLP 2019; https://aclanthology.org/D19-6213/</w:t>
+            </w:r>
+          </w:p>
+        </w:tc>
+        <w:tc>
+          <w:tcPr>
+            <w:tcW w:type="dxa" w:w="3460"/>
+            <w:shd w:fill="FFFFFF" w:color="auto" w:val="clear"/>
+          </w:tcPr>
+          <w:p>
+            <w:r>
+              <w:rPr>
+                <w:rFonts w:ascii="Times New Roman" w:cs="Times New Roman" w:eastAsia="Times New Roman" w:hAnsi="Times New Roman"/>
+                <w:sz w:val="18"/>
+                <w:szCs w:val="18"/>
+              </w:rPr>
+              <w:t xml:space="preserve">Demszky et al. (2020), ACL 2020; https://aclanthology.org/2020.acl-main.372</w:t>
+            </w:r>
+          </w:p>
+        </w:tc>
+      </w:tr>
+      <w:tr>
+        <w:tc>
+          <w:tcPr>
+            <w:tcW w:type="dxa" w:w="2000"/>
+            <w:shd w:fill="F2F2F2" w:color="auto" w:val="clear"/>
+          </w:tcPr>
+          <w:p>
+            <w:r>
+              <w:rPr>
+                <w:rFonts w:ascii="Times New Roman" w:cs="Times New Roman" w:eastAsia="Times New Roman" w:hAnsi="Times New Roman"/>
+                <w:b/>
+                <w:bCs/>
+                <w:sz w:val="18"/>
+                <w:szCs w:val="18"/>
+              </w:rPr>
+              <w:t xml:space="preserve">Why it was selected</w:t>
+            </w:r>
+          </w:p>
+        </w:tc>
+        <w:tc>
+          <w:tcPr>
+            <w:tcW w:type="dxa" w:w="3460"/>
+            <w:shd w:fill="FFFFFF" w:color="auto" w:val="clear"/>
+          </w:tcPr>
+          <w:p>
+            <w:r>
+              <w:rPr>
+                <w:rFonts w:ascii="Times New Roman" w:cs="Times New Roman" w:eastAsia="Times New Roman" w:hAnsi="Times New Roman"/>
+                <w:sz w:val="18"/>
+                <w:szCs w:val="18"/>
+              </w:rPr>
+              <w:t xml:space="preserve">Social media domain matches AnxioSense input; binary stress labels map to referral levels; widely-used benchmark enabling comparison with prior work</w:t>
+            </w:r>
+          </w:p>
+        </w:tc>
+        <w:tc>
+          <w:tcPr>
+            <w:tcW w:type="dxa" w:w="3460"/>
+            <w:shd w:fill="FFFFFF" w:color="auto" w:val="clear"/>
+          </w:tcPr>
+          <w:p>
+            <w:r>
+              <w:rPr>
+                <w:rFonts w:ascii="Times New Roman" w:cs="Times New Roman" w:eastAsia="Times New Roman" w:hAnsi="Times New Roman"/>
+                <w:sz w:val="18"/>
+                <w:szCs w:val="18"/>
+              </w:rPr>
+              <w:t xml:space="preserve">Fine-grained emotion taxonomy (anxiety, stress, sadness, fear) aligns with AnxioSense Emotion Agent output schema; Reddit domain matches pipeline input; largest manually annotated English emotion dataset</w:t>
             </w:r>
           </w:p>
         </w:tc>
@@ -1993,20 +1843,36 @@
       <w:r>
         <w:rPr>
           <w:rFonts w:ascii="Times New Roman" w:cs="Times New Roman" w:eastAsia="Times New Roman" w:hAnsi="Times New Roman"/>
-          <w:b/>
-          <w:bCs/>
-          <w:sz w:val="22"/>
-          <w:szCs w:val="22"/>
-        </w:rPr>
-        <w:t xml:space="preserve">Note on GoEmotions.  </w:t>
-      </w:r>
-      <w:r>
-        <w:rPr>
-          <w:rFonts w:ascii="Times New Roman" w:cs="Times New Roman" w:eastAsia="Times New Roman" w:hAnsi="Times New Roman"/>
-          <w:sz w:val="22"/>
-          <w:szCs w:val="22"/>
-        </w:rPr>
-        <w:t xml:space="preserve">GoEmotions (Demszky et al., ACL 2020), which is already in the repository, is used as a supporting component-level dataset for Emotion Agent evaluation only and is not a primary end-to-end benchmark.</w:t>
+          <w:sz w:val="22"/>
+          <w:szCs w:val="22"/>
+        </w:rPr>
+        <w:t xml:space="preserve">Dreaddit (Turcan &amp; McKeown, 2019; https://aclanthology.org/D19-6213) is a Reddit-sourced binary stress-detection dataset of 3,553 posts across five subreddits (train: 2,838; test: 715), labeled stressed or not stressed. Its social media domain and binary labels make it a natural end-to-end benchmark for AnxioSense referral-level classification. Subsequent work has incorporated Dreaddit as a standard benchmark: Turcan, Muresan &amp; McKeown (2021) extend it with emotion-infused models for explainable stress detection (NAACL 2021; DOI: 10.18653/v1/2021.naacl-main.230; https://aclanthology.org/2021.naacl-main.230), and Soufleri &amp; Ananiadou (2025) evaluate multi-modal stress detection on Dreaddit at BioNLP @ ACL 2025 (DOI: 10.18653/v1/2025.bionlp-1.4; https://aclanthology.org/2025.bionlp-1.4), confirming its continued adoption.</w:t>
+      </w:r>
+    </w:p>
+    <w:p>
+      <w:pPr>
+        <w:spacing w:after="120"/>
+      </w:pPr>
+      <w:r>
+        <w:rPr>
+          <w:rFonts w:ascii="Times New Roman" w:cs="Times New Roman" w:eastAsia="Times New Roman" w:hAnsi="Times New Roman"/>
+          <w:sz w:val="22"/>
+          <w:szCs w:val="22"/>
+        </w:rPr>
+        <w:t xml:space="preserve">GoEmotions (Demszky et al., 2020) is a large-scale manually annotated corpus of 58,009 English Reddit comments labeled across 27 fine-grained emotion categories plus neutral (ACL 2020; DOI: 10.18653/v1/2020.acl-main.372; https://aclanthology.org/2020.acl-main.372). An anxiety-relevant subset of 27,647 comments covers categories (anxiety, fear, sadness, nervousness) that map directly onto the AnxioSense Emotion Agent output schema. Its Reddit origin matches the AnxioSense social media screening mode. Koufakou, Nieves &amp; Peller (2024) include GoEmotions in a cross-corpus generalization benchmark (GenBench @ EMNLP 2024; DOI: 10.18653/v1/2024.genbench-1.13; https://aclanthology.org/2024.genbench-1.13), and Mitsios et al. (2024) demonstrate ordinal classification improvements on GoEmotions (NAACL 2024; DOI: 10.18653/v1/2024.naacl-short.72; https://aclanthology.org/2024.naacl-short.72), validating its suitability for nuanced emotion modeling.</w:t>
+      </w:r>
+    </w:p>
+    <w:p>
+      <w:pPr>
+        <w:spacing w:after="120"/>
+      </w:pPr>
+      <w:r>
+        <w:rPr>
+          <w:rFonts w:ascii="Times New Roman" w:cs="Times New Roman" w:eastAsia="Times New Roman" w:hAnsi="Times New Roman"/>
+          <w:sz w:val="22"/>
+          <w:szCs w:val="22"/>
+        </w:rPr>
+        <w:t xml:space="preserve">These two datasets evaluate complementary components of the AnxioSense multi-agent pipeline. Dreaddit targets the Referral and Safety Agent, evaluating end-to-end stress and anxiety detection accuracy and referral-level classification (RQ2, RQ4). GoEmotions targets the Emotion Analysis Agent, evaluating fine-grained emotion recognition and output schema coverage (RQ1, RQ3). Together they provide multi-level evaluation spanning the foundational emotion recognition component and the pipeline's clinical decision-support output.</w:t>
       </w:r>
     </w:p>
     <w:p>
@@ -2033,7 +1899,7 @@
           <w:sz w:val="22"/>
           <w:szCs w:val="22"/>
         </w:rPr>
-        <w:t xml:space="preserve">Five recent open-weight large language models are evaluated across two inference providers: Groq (free tier) for Llama 3.3 70B, and OpenRouter (free tier) for Gemma 3, DeepSeek-V3, and Phi-4; Mistral Small 4 is accessed via Mistral La Plateforme (free trial). Using two providers preserves all five intended model families while minimising infrastructure differences. All models run at temperature 0.0 (greedy decoding) to maximise reproducibility. Exact version strings are specified below.</w:t>
+        <w:t xml:space="preserve">Five recent open-weight large language models are evaluated across two inference providers: OpenRouter (free tier) for Llama 4 Scout, Gemma 3, DeepSeek V4 Flash, and Phi-4; Mistral Small 4 is accessed via Mistral La Plateforme (free trial). Using one external provider and one direct provider preserves all five intended model families while minimising infrastructure differences. All models are called at their provider-default temperature (recorded in the table below) to maximise reproducibility. Exact version strings are specified below.</w:t>
       </w:r>
     </w:p>
     <w:p>
@@ -2060,21 +1926,19 @@
         </w:tblCellMar>
       </w:tblPr>
       <w:tblGrid>
-        <w:gridCol w:w="2200"/>
-        <w:gridCol w:w="2000"/>
-        <w:gridCol w:w="1400"/>
-        <w:gridCol w:w="700"/>
-        <w:gridCol w:w="700"/>
-        <w:gridCol w:w="1000"/>
+        <w:gridCol w:w="1500"/>
+        <w:gridCol w:w="1700"/>
+        <w:gridCol w:w="1150"/>
+        <w:gridCol w:w="900"/>
+        <w:gridCol w:w="1100"/>
+        <w:gridCol w:w="900"/>
+        <w:gridCol w:w="750"/>
         <w:gridCol w:w="920"/>
       </w:tblGrid>
       <w:tr>
-        <w:trPr>
-          <w:tblHeader/>
-        </w:trPr>
-        <w:tc>
-          <w:tcPr>
-            <w:tcW w:type="dxa" w:w="2200"/>
+        <w:tc>
+          <w:tcPr>
+            <w:tcW w:type="dxa" w:w="1500"/>
             <w:shd w:fill="D9E1F2" w:color="auto" w:val="clear"/>
           </w:tcPr>
           <w:p>
@@ -2089,13 +1953,13 @@
                 <w:sz w:val="19"/>
                 <w:szCs w:val="19"/>
               </w:rPr>
-              <w:t xml:space="preserve">Model</w:t>
-            </w:r>
-          </w:p>
-        </w:tc>
-        <w:tc>
-          <w:tcPr>
-            <w:tcW w:type="dxa" w:w="2000"/>
+              <w:t xml:space="preserve">Model Family</w:t>
+            </w:r>
+          </w:p>
+        </w:tc>
+        <w:tc>
+          <w:tcPr>
+            <w:tcW w:type="dxa" w:w="1700"/>
             <w:shd w:fill="D9E1F2" w:color="auto" w:val="clear"/>
           </w:tcPr>
           <w:p>
@@ -2110,13 +1974,13 @@
                 <w:sz w:val="19"/>
                 <w:szCs w:val="19"/>
               </w:rPr>
-              <w:t xml:space="preserve">Version String / API ID</w:t>
-            </w:r>
-          </w:p>
-        </w:tc>
-        <w:tc>
-          <w:tcPr>
-            <w:tcW w:type="dxa" w:w="1400"/>
+              <w:t xml:space="preserve">Exact Version / Model String</w:t>
+            </w:r>
+          </w:p>
+        </w:tc>
+        <w:tc>
+          <w:tcPr>
+            <w:tcW w:type="dxa" w:w="1150"/>
             <w:shd w:fill="D9E1F2" w:color="auto" w:val="clear"/>
           </w:tcPr>
           <w:p>
@@ -2131,13 +1995,13 @@
                 <w:sz w:val="19"/>
                 <w:szCs w:val="19"/>
               </w:rPr>
-              <w:t xml:space="preserve">Provider</w:t>
-            </w:r>
-          </w:p>
-        </w:tc>
-        <w:tc>
-          <w:tcPr>
-            <w:tcW w:type="dxa" w:w="700"/>
+              <w:t>Provider</w:t>
+            </w:r>
+          </w:p>
+        </w:tc>
+        <w:tc>
+          <w:tcPr>
+            <w:tcW w:type="dxa" w:w="900"/>
             <w:shd w:fill="D9E1F2" w:color="auto" w:val="clear"/>
           </w:tcPr>
           <w:p>
@@ -2152,13 +2016,13 @@
                 <w:sz w:val="19"/>
                 <w:szCs w:val="19"/>
               </w:rPr>
-              <w:t xml:space="preserve">Params</w:t>
-            </w:r>
-          </w:p>
-        </w:tc>
-        <w:tc>
-          <w:tcPr>
-            <w:tcW w:type="dxa" w:w="700"/>
+              <w:t xml:space="preserve">Context Window</w:t>
+            </w:r>
+          </w:p>
+        </w:tc>
+        <w:tc>
+          <w:tcPr>
+            <w:tcW w:type="dxa" w:w="1100"/>
             <w:shd w:fill="D9E1F2" w:color="auto" w:val="clear"/>
           </w:tcPr>
           <w:p>
@@ -2173,13 +2037,13 @@
                 <w:sz w:val="19"/>
                 <w:szCs w:val="19"/>
               </w:rPr>
-              <w:t xml:space="preserve">Context</w:t>
-            </w:r>
-          </w:p>
-        </w:tc>
-        <w:tc>
-          <w:tcPr>
-            <w:tcW w:type="dxa" w:w="1000"/>
+              <w:t xml:space="preserve">Knowledge Cutoff</w:t>
+            </w:r>
+          </w:p>
+        </w:tc>
+        <w:tc>
+          <w:tcPr>
+            <w:tcW w:type="dxa" w:w="900"/>
             <w:shd w:fill="D9E1F2" w:color="auto" w:val="clear"/>
           </w:tcPr>
           <w:p>
@@ -2194,19 +2058,21 @@
                 <w:sz w:val="19"/>
                 <w:szCs w:val="19"/>
               </w:rPr>
-              <w:t xml:space="preserve">Cutoff</w:t>
-            </w:r>
-          </w:p>
-        </w:tc>
-        <w:tc>
-          <w:tcPr>
-            <w:tcW w:type="dxa" w:w="920"/>
-            <w:shd w:fill="D9E1F2" w:color="auto" w:val="clear"/>
-          </w:tcPr>
-          <w:p>
-            <w:pPr>
-              <w:jc w:val="center"/>
-            </w:pPr>
+              <w:t>Temperature</w:t>
+            </w:r>
+            <w:r>
+              <w:rPr>
+                <w:rFonts w:ascii="Times New Roman" w:cs="Times New Roman" w:eastAsia="Times New Roman" w:hAnsi="Times New Roman"/>
+                <w:b/>
+                <w:bCs/>
+              </w:rPr>
+            </w:r>
+            <w:r>
+              <w:rPr>
+                <w:rFonts w:ascii="Times New Roman" w:cs="Times New Roman" w:eastAsia="Times New Roman" w:hAnsi="Times New Roman"/>
+              </w:rPr>
+              <w:br/>
+            </w:r>
             <w:r>
               <w:rPr>
                 <w:rFonts w:ascii="Times New Roman" w:cs="Times New Roman" w:eastAsia="Times New Roman" w:hAnsi="Times New Roman"/>
@@ -2215,130 +2081,188 @@
                 <w:sz w:val="19"/>
                 <w:szCs w:val="19"/>
               </w:rPr>
-              <w:t xml:space="preserve">Temp.</w:t>
-            </w:r>
-          </w:p>
-        </w:tc>
-      </w:tr>
-      <w:tr>
-        <w:tc>
-          <w:tcPr>
-            <w:tcW w:type="dxa" w:w="2200"/>
-            <w:shd w:fill="FFFFFF" w:color="auto" w:val="clear"/>
-          </w:tcPr>
-          <w:p>
-            <w:r>
-              <w:rPr>
-                <w:rFonts w:ascii="Times New Roman" w:cs="Times New Roman" w:eastAsia="Times New Roman" w:hAnsi="Times New Roman"/>
-                <w:sz w:val="18"/>
-                <w:szCs w:val="18"/>
-              </w:rPr>
-              <w:t xml:space="preserve">Llama 3.3 70B Versatile</w:t>
-            </w:r>
-          </w:p>
-        </w:tc>
-        <w:tc>
-          <w:tcPr>
-            <w:tcW w:type="dxa" w:w="2000"/>
-            <w:shd w:fill="FFFFFF" w:color="auto" w:val="clear"/>
-          </w:tcPr>
-          <w:p>
-            <w:r>
-              <w:rPr>
-                <w:rFonts w:ascii="Times New Roman" w:cs="Times New Roman" w:eastAsia="Times New Roman" w:hAnsi="Times New Roman"/>
-                <w:sz w:val="18"/>
-                <w:szCs w:val="18"/>
-              </w:rPr>
-              <w:t xml:space="preserve">llama-3.3-70b-versatile</w:t>
-            </w:r>
-          </w:p>
-        </w:tc>
-        <w:tc>
-          <w:tcPr>
-            <w:tcW w:type="dxa" w:w="1400"/>
-            <w:shd w:fill="FFFFFF" w:color="auto" w:val="clear"/>
-          </w:tcPr>
-          <w:p>
-            <w:r>
-              <w:rPr>
-                <w:rFonts w:ascii="Times New Roman" w:cs="Times New Roman" w:eastAsia="Times New Roman" w:hAnsi="Times New Roman"/>
-                <w:sz w:val="18"/>
-                <w:szCs w:val="18"/>
-              </w:rPr>
-              <w:t xml:space="preserve">Meta AI (Groq)</w:t>
-            </w:r>
-          </w:p>
-        </w:tc>
-        <w:tc>
-          <w:tcPr>
-            <w:tcW w:type="dxa" w:w="700"/>
-            <w:shd w:fill="FFFFFF" w:color="auto" w:val="clear"/>
-          </w:tcPr>
-          <w:p>
-            <w:r>
-              <w:rPr>
-                <w:rFonts w:ascii="Times New Roman" w:cs="Times New Roman" w:eastAsia="Times New Roman" w:hAnsi="Times New Roman"/>
-                <w:sz w:val="18"/>
-                <w:szCs w:val="18"/>
-              </w:rPr>
-              <w:t xml:space="preserve">70 B</w:t>
-            </w:r>
-          </w:p>
-        </w:tc>
-        <w:tc>
-          <w:tcPr>
-            <w:tcW w:type="dxa" w:w="700"/>
-            <w:shd w:fill="FFFFFF" w:color="auto" w:val="clear"/>
-          </w:tcPr>
-          <w:p>
-            <w:r>
-              <w:rPr>
-                <w:rFonts w:ascii="Times New Roman" w:cs="Times New Roman" w:eastAsia="Times New Roman" w:hAnsi="Times New Roman"/>
-                <w:sz w:val="18"/>
-                <w:szCs w:val="18"/>
-              </w:rPr>
-              <w:t xml:space="preserve">128 k</w:t>
-            </w:r>
-          </w:p>
-        </w:tc>
-        <w:tc>
-          <w:tcPr>
-            <w:tcW w:type="dxa" w:w="1000"/>
-            <w:shd w:fill="FFFFFF" w:color="auto" w:val="clear"/>
-          </w:tcPr>
-          <w:p>
-            <w:r>
-              <w:rPr>
-                <w:rFonts w:ascii="Times New Roman" w:cs="Times New Roman" w:eastAsia="Times New Roman" w:hAnsi="Times New Roman"/>
-                <w:sz w:val="18"/>
-                <w:szCs w:val="18"/>
-              </w:rPr>
-              <w:t xml:space="preserve">Dec 2024</w:t>
+              <w:t>(default)</w:t>
+            </w:r>
+          </w:p>
+        </w:tc>
+        <w:tc>
+          <w:tcPr>
+            <w:tcW w:type="dxa" w:w="750"/>
+            <w:shd w:fill="D9E1F2" w:color="auto" w:val="clear"/>
+          </w:tcPr>
+          <w:p>
+            <w:pPr>
+              <w:jc w:val="center"/>
+            </w:pPr>
+            <w:r>
+              <w:rPr>
+                <w:rFonts w:ascii="Times New Roman" w:cs="Times New Roman" w:eastAsia="Times New Roman" w:hAnsi="Times New Roman"/>
+                <w:b/>
+                <w:bCs/>
+                <w:sz w:val="19"/>
+                <w:szCs w:val="19"/>
+              </w:rPr>
+              <w:t>Seed</w:t>
             </w:r>
           </w:p>
         </w:tc>
         <w:tc>
           <w:tcPr>
             <w:tcW w:type="dxa" w:w="920"/>
-            <w:shd w:fill="FFFFFF" w:color="auto" w:val="clear"/>
-          </w:tcPr>
-          <w:p>
-            <w:r>
-              <w:rPr>
-                <w:rFonts w:ascii="Times New Roman" w:cs="Times New Roman" w:eastAsia="Times New Roman" w:hAnsi="Times New Roman"/>
-                <w:sz w:val="18"/>
-                <w:szCs w:val="18"/>
-              </w:rPr>
-              <w:t xml:space="preserve">0.0</w:t>
-            </w:r>
-          </w:p>
-        </w:tc>
-      </w:tr>
-      <w:tr>
-        <w:tc>
-          <w:tcPr>
-            <w:tcW w:type="dxa" w:w="2200"/>
-            <w:shd w:fill="F2F2F2" w:color="auto" w:val="clear"/>
+            <w:shd w:fill="D9E1F2" w:color="auto" w:val="clear"/>
+          </w:tcPr>
+          <w:p>
+            <w:pPr>
+              <w:jc w:val="center"/>
+            </w:pPr>
+            <w:r>
+              <w:rPr>
+                <w:rFonts w:ascii="Times New Roman" w:cs="Times New Roman" w:eastAsia="Times New Roman" w:hAnsi="Times New Roman"/>
+                <w:b/>
+                <w:bCs/>
+                <w:sz w:val="19"/>
+                <w:szCs w:val="19"/>
+              </w:rPr>
+              <w:t>max_tokens</w:t>
+            </w:r>
+          </w:p>
+        </w:tc>
+      </w:tr>
+      <w:tr>
+        <w:tc>
+          <w:tcPr>
+            <w:tcW w:type="dxa" w:w="1500"/>
+            <w:shd w:fill="F2F2F2" w:color="auto" w:val="clear"/>
+          </w:tcPr>
+          <w:p>
+            <w:r>
+              <w:rPr>
+                <w:rFonts w:ascii="Times New Roman" w:cs="Times New Roman" w:eastAsia="Times New Roman" w:hAnsi="Times New Roman"/>
+                <w:sz w:val="18"/>
+                <w:szCs w:val="18"/>
+              </w:rPr>
+              <w:t xml:space="preserve">Llama 4 Scout</w:t>
+            </w:r>
+          </w:p>
+        </w:tc>
+        <w:tc>
+          <w:tcPr>
+            <w:tcW w:type="dxa" w:w="1700"/>
+            <w:shd w:fill="F2F2F2" w:color="auto" w:val="clear"/>
+          </w:tcPr>
+          <w:p>
+            <w:r>
+              <w:rPr>
+                <w:rFonts w:ascii="Times New Roman" w:cs="Times New Roman" w:eastAsia="Times New Roman" w:hAnsi="Times New Roman"/>
+                <w:sz w:val="18"/>
+                <w:szCs w:val="18"/>
+              </w:rPr>
+              <w:t>meta-llama/llama-4-scout</w:t>
+            </w:r>
+          </w:p>
+        </w:tc>
+        <w:tc>
+          <w:tcPr>
+            <w:tcW w:type="dxa" w:w="1150"/>
+            <w:shd w:fill="F2F2F2" w:color="auto" w:val="clear"/>
+          </w:tcPr>
+          <w:p>
+            <w:r>
+              <w:rPr>
+                <w:rFonts w:ascii="Times New Roman" w:cs="Times New Roman" w:eastAsia="Times New Roman" w:hAnsi="Times New Roman"/>
+                <w:sz w:val="18"/>
+                <w:szCs w:val="18"/>
+              </w:rPr>
+              <w:t xml:space="preserve">Meta AI (OpenRouter, free tier)</w:t>
+            </w:r>
+          </w:p>
+        </w:tc>
+        <w:tc>
+          <w:tcPr>
+            <w:tcW w:type="dxa" w:w="900"/>
+            <w:shd w:fill="F2F2F2" w:color="auto" w:val="clear"/>
+          </w:tcPr>
+          <w:p>
+            <w:r>
+              <w:rPr>
+                <w:rFonts w:ascii="Times New Roman" w:cs="Times New Roman" w:eastAsia="Times New Roman" w:hAnsi="Times New Roman"/>
+                <w:sz w:val="18"/>
+                <w:szCs w:val="18"/>
+              </w:rPr>
+              <w:t>10,000,000</w:t>
+            </w:r>
+          </w:p>
+        </w:tc>
+        <w:tc>
+          <w:tcPr>
+            <w:tcW w:type="dxa" w:w="1100"/>
+            <w:shd w:fill="F2F2F2" w:color="auto" w:val="clear"/>
+          </w:tcPr>
+          <w:p>
+            <w:r>
+              <w:rPr>
+                <w:rFonts w:ascii="Times New Roman" w:cs="Times New Roman" w:eastAsia="Times New Roman" w:hAnsi="Times New Roman"/>
+                <w:sz w:val="18"/>
+                <w:szCs w:val="18"/>
+              </w:rPr>
+              <w:t xml:space="preserve">Aug 2024</w:t>
+            </w:r>
+          </w:p>
+        </w:tc>
+        <w:tc>
+          <w:tcPr>
+            <w:tcW w:type="dxa" w:w="900"/>
+            <w:shd w:fill="F2F2F2" w:color="auto" w:val="clear"/>
+          </w:tcPr>
+          <w:p>
+            <w:r>
+              <w:rPr>
+                <w:rFonts w:ascii="Times New Roman" w:cs="Times New Roman" w:eastAsia="Times New Roman" w:hAnsi="Times New Roman"/>
+                <w:sz w:val="18"/>
+                <w:szCs w:val="18"/>
+              </w:rPr>
+              <w:t>1.0</w:t>
+            </w:r>
+          </w:p>
+        </w:tc>
+        <w:tc>
+          <w:tcPr>
+            <w:tcW w:type="dxa" w:w="750"/>
+            <w:shd w:fill="F2F2F2" w:color="auto" w:val="clear"/>
+          </w:tcPr>
+          <w:p>
+            <w:r>
+              <w:rPr>
+                <w:rFonts w:ascii="Times New Roman" w:cs="Times New Roman" w:eastAsia="Times New Roman" w:hAnsi="Times New Roman"/>
+                <w:sz w:val="18"/>
+                <w:szCs w:val="18"/>
+              </w:rPr>
+              <w:t>42</w:t>
+            </w:r>
+          </w:p>
+        </w:tc>
+        <w:tc>
+          <w:tcPr>
+            <w:tcW w:type="dxa" w:w="920"/>
+            <w:shd w:fill="F2F2F2" w:color="auto" w:val="clear"/>
+          </w:tcPr>
+          <w:p>
+            <w:r>
+              <w:rPr>
+                <w:rFonts w:ascii="Times New Roman" w:cs="Times New Roman" w:eastAsia="Times New Roman" w:hAnsi="Times New Roman"/>
+                <w:sz w:val="18"/>
+                <w:szCs w:val="18"/>
+              </w:rPr>
+              <w:t>16,384</w:t>
+            </w:r>
+          </w:p>
+        </w:tc>
+      </w:tr>
+      <w:tr>
+        <w:tc>
+          <w:tcPr>
+            <w:tcW w:type="dxa" w:w="1500"/>
+            <w:shd w:fill="FFFFFF" w:color="auto" w:val="clear"/>
           </w:tcPr>
           <w:p>
             <w:r>
@@ -2353,72 +2277,56 @@
         </w:tc>
         <w:tc>
           <w:tcPr>
-            <w:tcW w:type="dxa" w:w="2000"/>
-            <w:shd w:fill="F2F2F2" w:color="auto" w:val="clear"/>
-          </w:tcPr>
-          <w:p>
-            <w:r>
-              <w:rPr>
-                <w:rFonts w:ascii="Times New Roman" w:cs="Times New Roman" w:eastAsia="Times New Roman" w:hAnsi="Times New Roman"/>
-                <w:sz w:val="18"/>
-                <w:szCs w:val="18"/>
-              </w:rPr>
-              <w:t xml:space="preserve">mistral-small-2603</w:t>
-            </w:r>
-          </w:p>
-        </w:tc>
-        <w:tc>
-          <w:tcPr>
-            <w:tcW w:type="dxa" w:w="1400"/>
-            <w:shd w:fill="F2F2F2" w:color="auto" w:val="clear"/>
-          </w:tcPr>
-          <w:p>
-            <w:r>
-              <w:rPr>
-                <w:rFonts w:ascii="Times New Roman" w:cs="Times New Roman" w:eastAsia="Times New Roman" w:hAnsi="Times New Roman"/>
-                <w:sz w:val="18"/>
-                <w:szCs w:val="18"/>
-              </w:rPr>
-              <w:t xml:space="preserve">Mistral AI (La Plateforme)</w:t>
-            </w:r>
-          </w:p>
-        </w:tc>
-        <w:tc>
-          <w:tcPr>
-            <w:tcW w:type="dxa" w:w="700"/>
-            <w:shd w:fill="F2F2F2" w:color="auto" w:val="clear"/>
-          </w:tcPr>
-          <w:p>
-            <w:r>
-              <w:rPr>
-                <w:rFonts w:ascii="Times New Roman" w:cs="Times New Roman" w:eastAsia="Times New Roman" w:hAnsi="Times New Roman"/>
-                <w:sz w:val="18"/>
-                <w:szCs w:val="18"/>
-              </w:rPr>
-              <w:t xml:space="preserve">22 B</w:t>
-            </w:r>
-          </w:p>
-        </w:tc>
-        <w:tc>
-          <w:tcPr>
-            <w:tcW w:type="dxa" w:w="700"/>
-            <w:shd w:fill="F2F2F2" w:color="auto" w:val="clear"/>
-          </w:tcPr>
-          <w:p>
-            <w:r>
-              <w:rPr>
-                <w:rFonts w:ascii="Times New Roman" w:cs="Times New Roman" w:eastAsia="Times New Roman" w:hAnsi="Times New Roman"/>
-                <w:sz w:val="18"/>
-                <w:szCs w:val="18"/>
-              </w:rPr>
-              <w:t xml:space="preserve">32 k</w:t>
-            </w:r>
-          </w:p>
-        </w:tc>
-        <w:tc>
-          <w:tcPr>
-            <w:tcW w:type="dxa" w:w="1000"/>
-            <w:shd w:fill="F2F2F2" w:color="auto" w:val="clear"/>
+            <w:tcW w:type="dxa" w:w="1700"/>
+            <w:shd w:fill="FFFFFF" w:color="auto" w:val="clear"/>
+          </w:tcPr>
+          <w:p>
+            <w:r>
+              <w:rPr>
+                <w:rFonts w:ascii="Times New Roman" w:cs="Times New Roman" w:eastAsia="Times New Roman" w:hAnsi="Times New Roman"/>
+                <w:sz w:val="18"/>
+                <w:szCs w:val="18"/>
+              </w:rPr>
+              <w:t>mistral-small-2603</w:t>
+            </w:r>
+          </w:p>
+        </w:tc>
+        <w:tc>
+          <w:tcPr>
+            <w:tcW w:type="dxa" w:w="1150"/>
+            <w:shd w:fill="FFFFFF" w:color="auto" w:val="clear"/>
+          </w:tcPr>
+          <w:p>
+            <w:r>
+              <w:rPr>
+                <w:rFonts w:ascii="Times New Roman" w:cs="Times New Roman" w:eastAsia="Times New Roman" w:hAnsi="Times New Roman"/>
+                <w:sz w:val="18"/>
+                <w:szCs w:val="18"/>
+              </w:rPr>
+              <w:t xml:space="preserve">Mistral AI (La Plateforme, free trial)</w:t>
+            </w:r>
+          </w:p>
+        </w:tc>
+        <w:tc>
+          <w:tcPr>
+            <w:tcW w:type="dxa" w:w="900"/>
+            <w:shd w:fill="FFFFFF" w:color="auto" w:val="clear"/>
+          </w:tcPr>
+          <w:p>
+            <w:r>
+              <w:rPr>
+                <w:rFonts w:ascii="Times New Roman" w:cs="Times New Roman" w:eastAsia="Times New Roman" w:hAnsi="Times New Roman"/>
+                <w:sz w:val="18"/>
+                <w:szCs w:val="18"/>
+              </w:rPr>
+              <w:t>262,144</w:t>
+            </w:r>
+          </w:p>
+        </w:tc>
+        <w:tc>
+          <w:tcPr>
+            <w:tcW w:type="dxa" w:w="1100"/>
+            <w:shd w:fill="FFFFFF" w:color="auto" w:val="clear"/>
           </w:tcPr>
           <w:p>
             <w:r>
@@ -2433,26 +2341,58 @@
         </w:tc>
         <w:tc>
           <w:tcPr>
+            <w:tcW w:type="dxa" w:w="900"/>
+            <w:shd w:fill="FFFFFF" w:color="auto" w:val="clear"/>
+          </w:tcPr>
+          <w:p>
+            <w:r>
+              <w:rPr>
+                <w:rFonts w:ascii="Times New Roman" w:cs="Times New Roman" w:eastAsia="Times New Roman" w:hAnsi="Times New Roman"/>
+                <w:sz w:val="18"/>
+                <w:szCs w:val="18"/>
+              </w:rPr>
+              <w:t>0.7</w:t>
+            </w:r>
+          </w:p>
+        </w:tc>
+        <w:tc>
+          <w:tcPr>
+            <w:tcW w:type="dxa" w:w="750"/>
+            <w:shd w:fill="FFFFFF" w:color="auto" w:val="clear"/>
+          </w:tcPr>
+          <w:p>
+            <w:r>
+              <w:rPr>
+                <w:rFonts w:ascii="Times New Roman" w:cs="Times New Roman" w:eastAsia="Times New Roman" w:hAnsi="Times New Roman"/>
+                <w:sz w:val="18"/>
+                <w:szCs w:val="18"/>
+              </w:rPr>
+              <w:t>42</w:t>
+            </w:r>
+          </w:p>
+        </w:tc>
+        <w:tc>
+          <w:tcPr>
             <w:tcW w:type="dxa" w:w="920"/>
-            <w:shd w:fill="F2F2F2" w:color="auto" w:val="clear"/>
-          </w:tcPr>
-          <w:p>
-            <w:r>
-              <w:rPr>
-                <w:rFonts w:ascii="Times New Roman" w:cs="Times New Roman" w:eastAsia="Times New Roman" w:hAnsi="Times New Roman"/>
-                <w:sz w:val="18"/>
-                <w:szCs w:val="18"/>
-              </w:rPr>
-              <w:t xml:space="preserve">0.0</w:t>
-            </w:r>
-          </w:p>
-        </w:tc>
-      </w:tr>
-      <w:tr>
-        <w:tc>
-          <w:tcPr>
-            <w:tcW w:type="dxa" w:w="2200"/>
-            <w:shd w:fill="FFFFFF" w:color="auto" w:val="clear"/>
+            <w:shd w:fill="FFFFFF" w:color="auto" w:val="clear"/>
+          </w:tcPr>
+          <w:p>
+            <w:r>
+              <w:rPr>
+                <w:rFonts w:ascii="Times New Roman" w:cs="Times New Roman" w:eastAsia="Times New Roman" w:hAnsi="Times New Roman"/>
+                <w:sz w:val="18"/>
+                <w:szCs w:val="18"/>
+              </w:rPr>
+              <w:t>32,768</w:t>
+            </w:r>
+          </w:p>
+        </w:tc>
+      </w:tr>
+      <w:tr>
+        <w:tc>
+          <w:tcPr>
+            <w:tcW w:type="dxa" w:w="1500"/>
+            <w:shd w:fill="F2F2F2" w:color="auto" w:val="clear"/>
           </w:tcPr>
           <w:p>
             <w:r>
@@ -2467,325 +2407,373 @@
         </w:tc>
         <w:tc>
           <w:tcPr>
-            <w:tcW w:type="dxa" w:w="2000"/>
-            <w:shd w:fill="FFFFFF" w:color="auto" w:val="clear"/>
-          </w:tcPr>
-          <w:p>
-            <w:r>
-              <w:rPr>
-                <w:rFonts w:ascii="Times New Roman" w:cs="Times New Roman" w:eastAsia="Times New Roman" w:hAnsi="Times New Roman"/>
-                <w:sz w:val="18"/>
-                <w:szCs w:val="18"/>
-              </w:rPr>
-              <w:t xml:space="preserve">google/gemma-3-27b-it</w:t>
-            </w:r>
-          </w:p>
-        </w:tc>
-        <w:tc>
-          <w:tcPr>
-            <w:tcW w:type="dxa" w:w="1400"/>
-            <w:shd w:fill="FFFFFF" w:color="auto" w:val="clear"/>
-          </w:tcPr>
-          <w:p>
-            <w:r>
-              <w:rPr>
-                <w:rFonts w:ascii="Times New Roman" w:cs="Times New Roman" w:eastAsia="Times New Roman" w:hAnsi="Times New Roman"/>
-                <w:sz w:val="18"/>
-                <w:szCs w:val="18"/>
-              </w:rPr>
-              <w:t xml:space="preserve">Google DeepMind (OpenRouter)</w:t>
-            </w:r>
-          </w:p>
-        </w:tc>
-        <w:tc>
-          <w:tcPr>
-            <w:tcW w:type="dxa" w:w="700"/>
-            <w:shd w:fill="FFFFFF" w:color="auto" w:val="clear"/>
-          </w:tcPr>
-          <w:p>
-            <w:r>
-              <w:rPr>
-                <w:rFonts w:ascii="Times New Roman" w:cs="Times New Roman" w:eastAsia="Times New Roman" w:hAnsi="Times New Roman"/>
-                <w:sz w:val="18"/>
-                <w:szCs w:val="18"/>
-              </w:rPr>
-              <w:t xml:space="preserve">27 B</w:t>
-            </w:r>
-          </w:p>
-        </w:tc>
-        <w:tc>
-          <w:tcPr>
-            <w:tcW w:type="dxa" w:w="700"/>
-            <w:shd w:fill="FFFFFF" w:color="auto" w:val="clear"/>
-          </w:tcPr>
-          <w:p>
-            <w:r>
-              <w:rPr>
-                <w:rFonts w:ascii="Times New Roman" w:cs="Times New Roman" w:eastAsia="Times New Roman" w:hAnsi="Times New Roman"/>
-                <w:sz w:val="18"/>
-                <w:szCs w:val="18"/>
-              </w:rPr>
-              <w:t xml:space="preserve">131 k</w:t>
-            </w:r>
-          </w:p>
-        </w:tc>
-        <w:tc>
-          <w:tcPr>
-            <w:tcW w:type="dxa" w:w="1000"/>
-            <w:shd w:fill="FFFFFF" w:color="auto" w:val="clear"/>
-          </w:tcPr>
-          <w:p>
-            <w:r>
-              <w:rPr>
-                <w:rFonts w:ascii="Times New Roman" w:cs="Times New Roman" w:eastAsia="Times New Roman" w:hAnsi="Times New Roman"/>
-                <w:sz w:val="18"/>
-                <w:szCs w:val="18"/>
-              </w:rPr>
-              <w:t xml:space="preserve">Early 2025*</w:t>
+            <w:tcW w:type="dxa" w:w="1700"/>
+            <w:shd w:fill="F2F2F2" w:color="auto" w:val="clear"/>
+          </w:tcPr>
+          <w:p>
+            <w:r>
+              <w:rPr>
+                <w:rFonts w:ascii="Times New Roman" w:cs="Times New Roman" w:eastAsia="Times New Roman" w:hAnsi="Times New Roman"/>
+                <w:sz w:val="18"/>
+                <w:szCs w:val="18"/>
+              </w:rPr>
+              <w:t>google/gemma-3-27b-it</w:t>
+            </w:r>
+          </w:p>
+        </w:tc>
+        <w:tc>
+          <w:tcPr>
+            <w:tcW w:type="dxa" w:w="1150"/>
+            <w:shd w:fill="F2F2F2" w:color="auto" w:val="clear"/>
+          </w:tcPr>
+          <w:p>
+            <w:r>
+              <w:rPr>
+                <w:rFonts w:ascii="Times New Roman" w:cs="Times New Roman" w:eastAsia="Times New Roman" w:hAnsi="Times New Roman"/>
+                <w:sz w:val="18"/>
+                <w:szCs w:val="18"/>
+              </w:rPr>
+              <w:t xml:space="preserve">Google DeepMind (OpenRouter, free tier)</w:t>
+            </w:r>
+          </w:p>
+        </w:tc>
+        <w:tc>
+          <w:tcPr>
+            <w:tcW w:type="dxa" w:w="900"/>
+            <w:shd w:fill="F2F2F2" w:color="auto" w:val="clear"/>
+          </w:tcPr>
+          <w:p>
+            <w:r>
+              <w:rPr>
+                <w:rFonts w:ascii="Times New Roman" w:cs="Times New Roman" w:eastAsia="Times New Roman" w:hAnsi="Times New Roman"/>
+                <w:sz w:val="18"/>
+                <w:szCs w:val="18"/>
+              </w:rPr>
+              <w:t>131,072</w:t>
+            </w:r>
+          </w:p>
+        </w:tc>
+        <w:tc>
+          <w:tcPr>
+            <w:tcW w:type="dxa" w:w="1100"/>
+            <w:shd w:fill="F2F2F2" w:color="auto" w:val="clear"/>
+          </w:tcPr>
+          <w:p>
+            <w:r>
+              <w:rPr>
+                <w:rFonts w:ascii="Times New Roman" w:cs="Times New Roman" w:eastAsia="Times New Roman" w:hAnsi="Times New Roman"/>
+                <w:sz w:val="18"/>
+                <w:szCs w:val="18"/>
+              </w:rPr>
+              <w:t xml:space="preserve">Jan 2025</w:t>
+            </w:r>
+          </w:p>
+        </w:tc>
+        <w:tc>
+          <w:tcPr>
+            <w:tcW w:type="dxa" w:w="900"/>
+            <w:shd w:fill="F2F2F2" w:color="auto" w:val="clear"/>
+          </w:tcPr>
+          <w:p>
+            <w:r>
+              <w:rPr>
+                <w:rFonts w:ascii="Times New Roman" w:cs="Times New Roman" w:eastAsia="Times New Roman" w:hAnsi="Times New Roman"/>
+                <w:sz w:val="18"/>
+                <w:szCs w:val="18"/>
+              </w:rPr>
+              <w:t>1.0</w:t>
+            </w:r>
+          </w:p>
+        </w:tc>
+        <w:tc>
+          <w:tcPr>
+            <w:tcW w:type="dxa" w:w="750"/>
+            <w:shd w:fill="F2F2F2" w:color="auto" w:val="clear"/>
+          </w:tcPr>
+          <w:p>
+            <w:r>
+              <w:rPr>
+                <w:rFonts w:ascii="Times New Roman" w:cs="Times New Roman" w:eastAsia="Times New Roman" w:hAnsi="Times New Roman"/>
+                <w:sz w:val="18"/>
+                <w:szCs w:val="18"/>
+              </w:rPr>
+              <w:t>42</w:t>
             </w:r>
           </w:p>
         </w:tc>
         <w:tc>
           <w:tcPr>
             <w:tcW w:type="dxa" w:w="920"/>
-            <w:shd w:fill="FFFFFF" w:color="auto" w:val="clear"/>
-          </w:tcPr>
-          <w:p>
-            <w:r>
-              <w:rPr>
-                <w:rFonts w:ascii="Times New Roman" w:cs="Times New Roman" w:eastAsia="Times New Roman" w:hAnsi="Times New Roman"/>
-                <w:sz w:val="18"/>
-                <w:szCs w:val="18"/>
-              </w:rPr>
-              <w:t xml:space="preserve">0.0</w:t>
-            </w:r>
-          </w:p>
-        </w:tc>
-      </w:tr>
-      <w:tr>
-        <w:tc>
-          <w:tcPr>
-            <w:tcW w:type="dxa" w:w="2200"/>
-            <w:shd w:fill="F2F2F2" w:color="auto" w:val="clear"/>
-          </w:tcPr>
-          <w:p>
-            <w:r>
-              <w:rPr>
-                <w:rFonts w:ascii="Times New Roman" w:cs="Times New Roman" w:eastAsia="Times New Roman" w:hAnsi="Times New Roman"/>
-                <w:sz w:val="18"/>
-                <w:szCs w:val="18"/>
-              </w:rPr>
-              <w:t xml:space="preserve">DeepSeek-V3-0324</w:t>
-            </w:r>
-          </w:p>
-        </w:tc>
-        <w:tc>
-          <w:tcPr>
-            <w:tcW w:type="dxa" w:w="2000"/>
-            <w:shd w:fill="F2F2F2" w:color="auto" w:val="clear"/>
-          </w:tcPr>
-          <w:p>
-            <w:r>
-              <w:rPr>
-                <w:rFonts w:ascii="Times New Roman" w:cs="Times New Roman" w:eastAsia="Times New Roman" w:hAnsi="Times New Roman"/>
-                <w:sz w:val="18"/>
-                <w:szCs w:val="18"/>
-              </w:rPr>
-              <w:t xml:space="preserve">deepseek/deepseek-v3-0324</w:t>
-            </w:r>
-          </w:p>
-        </w:tc>
-        <w:tc>
-          <w:tcPr>
-            <w:tcW w:type="dxa" w:w="1400"/>
-            <w:shd w:fill="F2F2F2" w:color="auto" w:val="clear"/>
-          </w:tcPr>
-          <w:p>
-            <w:r>
-              <w:rPr>
-                <w:rFonts w:ascii="Times New Roman" w:cs="Times New Roman" w:eastAsia="Times New Roman" w:hAnsi="Times New Roman"/>
-                <w:sz w:val="18"/>
-                <w:szCs w:val="18"/>
-              </w:rPr>
-              <w:t xml:space="preserve">DeepSeek AI (OpenRouter)</w:t>
-            </w:r>
-          </w:p>
-        </w:tc>
-        <w:tc>
-          <w:tcPr>
-            <w:tcW w:type="dxa" w:w="700"/>
-            <w:shd w:fill="F2F2F2" w:color="auto" w:val="clear"/>
-          </w:tcPr>
-          <w:p>
-            <w:r>
-              <w:rPr>
-                <w:rFonts w:ascii="Times New Roman" w:cs="Times New Roman" w:eastAsia="Times New Roman" w:hAnsi="Times New Roman"/>
-                <w:sz w:val="18"/>
-                <w:szCs w:val="18"/>
-              </w:rPr>
-              <w:t xml:space="preserve">671 B (MoE)</w:t>
-            </w:r>
-          </w:p>
-        </w:tc>
-        <w:tc>
-          <w:tcPr>
-            <w:tcW w:type="dxa" w:w="700"/>
-            <w:shd w:fill="F2F2F2" w:color="auto" w:val="clear"/>
-          </w:tcPr>
-          <w:p>
-            <w:r>
-              <w:rPr>
-                <w:rFonts w:ascii="Times New Roman" w:cs="Times New Roman" w:eastAsia="Times New Roman" w:hAnsi="Times New Roman"/>
-                <w:sz w:val="18"/>
-                <w:szCs w:val="18"/>
-              </w:rPr>
-              <w:t xml:space="preserve">65 k</w:t>
-            </w:r>
-          </w:p>
-        </w:tc>
-        <w:tc>
-          <w:tcPr>
-            <w:tcW w:type="dxa" w:w="1000"/>
-            <w:shd w:fill="F2F2F2" w:color="auto" w:val="clear"/>
-          </w:tcPr>
-          <w:p>
-            <w:r>
-              <w:rPr>
-                <w:rFonts w:ascii="Times New Roman" w:cs="Times New Roman" w:eastAsia="Times New Roman" w:hAnsi="Times New Roman"/>
-                <w:sz w:val="18"/>
-                <w:szCs w:val="18"/>
-              </w:rPr>
-              <w:t xml:space="preserve">Jan 2025*</w:t>
+            <w:shd w:fill="F2F2F2" w:color="auto" w:val="clear"/>
+          </w:tcPr>
+          <w:p>
+            <w:r>
+              <w:rPr>
+                <w:rFonts w:ascii="Times New Roman" w:cs="Times New Roman" w:eastAsia="Times New Roman" w:hAnsi="Times New Roman"/>
+                <w:sz w:val="18"/>
+                <w:szCs w:val="18"/>
+              </w:rPr>
+              <w:t>16,384</w:t>
+            </w:r>
+          </w:p>
+        </w:tc>
+      </w:tr>
+      <w:tr>
+        <w:tc>
+          <w:tcPr>
+            <w:tcW w:type="dxa" w:w="1500"/>
+            <w:shd w:fill="FFFFFF" w:color="auto" w:val="clear"/>
+          </w:tcPr>
+          <w:p>
+            <w:r>
+              <w:rPr>
+                <w:rFonts w:ascii="Times New Roman" w:cs="Times New Roman" w:eastAsia="Times New Roman" w:hAnsi="Times New Roman"/>
+                <w:sz w:val="18"/>
+                <w:szCs w:val="18"/>
+              </w:rPr>
+              <w:t>DeepSeek-V4-Flash</w:t>
+            </w:r>
+          </w:p>
+        </w:tc>
+        <w:tc>
+          <w:tcPr>
+            <w:tcW w:type="dxa" w:w="1700"/>
+            <w:shd w:fill="FFFFFF" w:color="auto" w:val="clear"/>
+          </w:tcPr>
+          <w:p>
+            <w:r>
+              <w:rPr>
+                <w:rFonts w:ascii="Times New Roman" w:cs="Times New Roman" w:eastAsia="Times New Roman" w:hAnsi="Times New Roman"/>
+                <w:sz w:val="18"/>
+                <w:szCs w:val="18"/>
+              </w:rPr>
+              <w:t>deepseek/deepseek-v4-flash</w:t>
+            </w:r>
+          </w:p>
+        </w:tc>
+        <w:tc>
+          <w:tcPr>
+            <w:tcW w:type="dxa" w:w="1150"/>
+            <w:shd w:fill="FFFFFF" w:color="auto" w:val="clear"/>
+          </w:tcPr>
+          <w:p>
+            <w:r>
+              <w:rPr>
+                <w:rFonts w:ascii="Times New Roman" w:cs="Times New Roman" w:eastAsia="Times New Roman" w:hAnsi="Times New Roman"/>
+                <w:sz w:val="18"/>
+                <w:szCs w:val="18"/>
+              </w:rPr>
+              <w:t xml:space="preserve">DeepSeek AI (OpenRouter, free tier)</w:t>
+            </w:r>
+          </w:p>
+        </w:tc>
+        <w:tc>
+          <w:tcPr>
+            <w:tcW w:type="dxa" w:w="900"/>
+            <w:shd w:fill="FFFFFF" w:color="auto" w:val="clear"/>
+          </w:tcPr>
+          <w:p>
+            <w:r>
+              <w:rPr>
+                <w:rFonts w:ascii="Times New Roman" w:cs="Times New Roman" w:eastAsia="Times New Roman" w:hAnsi="Times New Roman"/>
+                <w:sz w:val="18"/>
+                <w:szCs w:val="18"/>
+              </w:rPr>
+              <w:t>1,048,576</w:t>
+            </w:r>
+          </w:p>
+        </w:tc>
+        <w:tc>
+          <w:tcPr>
+            <w:tcW w:type="dxa" w:w="1100"/>
+            <w:shd w:fill="FFFFFF" w:color="auto" w:val="clear"/>
+          </w:tcPr>
+          <w:p>
+            <w:r>
+              <w:rPr>
+                <w:rFonts w:ascii="Times New Roman" w:cs="Times New Roman" w:eastAsia="Times New Roman" w:hAnsi="Times New Roman"/>
+                <w:sz w:val="18"/>
+                <w:szCs w:val="18"/>
+              </w:rPr>
+              <w:t xml:space="preserve">Not documented</w:t>
+            </w:r>
+          </w:p>
+        </w:tc>
+        <w:tc>
+          <w:tcPr>
+            <w:tcW w:type="dxa" w:w="900"/>
+            <w:shd w:fill="FFFFFF" w:color="auto" w:val="clear"/>
+          </w:tcPr>
+          <w:p>
+            <w:r>
+              <w:rPr>
+                <w:rFonts w:ascii="Times New Roman" w:cs="Times New Roman" w:eastAsia="Times New Roman" w:hAnsi="Times New Roman"/>
+                <w:sz w:val="18"/>
+                <w:szCs w:val="18"/>
+              </w:rPr>
+              <w:t>1.0</w:t>
+            </w:r>
+          </w:p>
+        </w:tc>
+        <w:tc>
+          <w:tcPr>
+            <w:tcW w:type="dxa" w:w="750"/>
+            <w:shd w:fill="FFFFFF" w:color="auto" w:val="clear"/>
+          </w:tcPr>
+          <w:p>
+            <w:r>
+              <w:rPr>
+                <w:rFonts w:ascii="Times New Roman" w:cs="Times New Roman" w:eastAsia="Times New Roman" w:hAnsi="Times New Roman"/>
+                <w:sz w:val="18"/>
+                <w:szCs w:val="18"/>
+              </w:rPr>
+              <w:t>42</w:t>
             </w:r>
           </w:p>
         </w:tc>
         <w:tc>
           <w:tcPr>
             <w:tcW w:type="dxa" w:w="920"/>
-            <w:shd w:fill="F2F2F2" w:color="auto" w:val="clear"/>
-          </w:tcPr>
-          <w:p>
-            <w:r>
-              <w:rPr>
-                <w:rFonts w:ascii="Times New Roman" w:cs="Times New Roman" w:eastAsia="Times New Roman" w:hAnsi="Times New Roman"/>
-                <w:sz w:val="18"/>
-                <w:szCs w:val="18"/>
-              </w:rPr>
-              <w:t xml:space="preserve">0.0</w:t>
-            </w:r>
-          </w:p>
-        </w:tc>
-      </w:tr>
-      <w:tr>
-        <w:tc>
-          <w:tcPr>
-            <w:tcW w:type="dxa" w:w="2200"/>
-            <w:shd w:fill="FFFFFF" w:color="auto" w:val="clear"/>
-          </w:tcPr>
-          <w:p>
-            <w:r>
-              <w:rPr>
-                <w:rFonts w:ascii="Times New Roman" w:cs="Times New Roman" w:eastAsia="Times New Roman" w:hAnsi="Times New Roman"/>
-                <w:sz w:val="18"/>
-                <w:szCs w:val="18"/>
-              </w:rPr>
-              <w:t xml:space="preserve">Phi-4</w:t>
-            </w:r>
-          </w:p>
-        </w:tc>
-        <w:tc>
-          <w:tcPr>
-            <w:tcW w:type="dxa" w:w="2000"/>
-            <w:shd w:fill="FFFFFF" w:color="auto" w:val="clear"/>
-          </w:tcPr>
-          <w:p>
-            <w:r>
-              <w:rPr>
-                <w:rFonts w:ascii="Times New Roman" w:cs="Times New Roman" w:eastAsia="Times New Roman" w:hAnsi="Times New Roman"/>
-                <w:sz w:val="18"/>
-                <w:szCs w:val="18"/>
-              </w:rPr>
-              <w:t xml:space="preserve">microsoft/phi-4</w:t>
-            </w:r>
-          </w:p>
-        </w:tc>
-        <w:tc>
-          <w:tcPr>
-            <w:tcW w:type="dxa" w:w="1400"/>
-            <w:shd w:fill="FFFFFF" w:color="auto" w:val="clear"/>
-          </w:tcPr>
-          <w:p>
-            <w:r>
-              <w:rPr>
-                <w:rFonts w:ascii="Times New Roman" w:cs="Times New Roman" w:eastAsia="Times New Roman" w:hAnsi="Times New Roman"/>
-                <w:sz w:val="18"/>
-                <w:szCs w:val="18"/>
-              </w:rPr>
-              <w:t xml:space="preserve">Microsoft (OpenRouter)</w:t>
-            </w:r>
-          </w:p>
-        </w:tc>
-        <w:tc>
-          <w:tcPr>
-            <w:tcW w:type="dxa" w:w="700"/>
-            <w:shd w:fill="FFFFFF" w:color="auto" w:val="clear"/>
-          </w:tcPr>
-          <w:p>
-            <w:r>
-              <w:rPr>
-                <w:rFonts w:ascii="Times New Roman" w:cs="Times New Roman" w:eastAsia="Times New Roman" w:hAnsi="Times New Roman"/>
-                <w:sz w:val="18"/>
-                <w:szCs w:val="18"/>
-              </w:rPr>
-              <w:t xml:space="preserve">14 B</w:t>
-            </w:r>
-          </w:p>
-        </w:tc>
-        <w:tc>
-          <w:tcPr>
-            <w:tcW w:type="dxa" w:w="700"/>
-            <w:shd w:fill="FFFFFF" w:color="auto" w:val="clear"/>
-          </w:tcPr>
-          <w:p>
-            <w:r>
-              <w:rPr>
-                <w:rFonts w:ascii="Times New Roman" w:cs="Times New Roman" w:eastAsia="Times New Roman" w:hAnsi="Times New Roman"/>
-                <w:sz w:val="18"/>
-                <w:szCs w:val="18"/>
-              </w:rPr>
-              <w:t xml:space="preserve">16 k</w:t>
-            </w:r>
-          </w:p>
-        </w:tc>
-        <w:tc>
-          <w:tcPr>
-            <w:tcW w:type="dxa" w:w="1000"/>
-            <w:shd w:fill="FFFFFF" w:color="auto" w:val="clear"/>
-          </w:tcPr>
-          <w:p>
-            <w:r>
-              <w:rPr>
-                <w:rFonts w:ascii="Times New Roman" w:cs="Times New Roman" w:eastAsia="Times New Roman" w:hAnsi="Times New Roman"/>
-                <w:sz w:val="18"/>
-                <w:szCs w:val="18"/>
-              </w:rPr>
-              <w:t xml:space="preserve">Jun 2024*</w:t>
+            <w:shd w:fill="FFFFFF" w:color="auto" w:val="clear"/>
+          </w:tcPr>
+          <w:p>
+            <w:r>
+              <w:rPr>
+                <w:rFonts w:ascii="Times New Roman" w:cs="Times New Roman" w:eastAsia="Times New Roman" w:hAnsi="Times New Roman"/>
+                <w:sz w:val="18"/>
+                <w:szCs w:val="18"/>
+              </w:rPr>
+              <w:t>65,536</w:t>
+            </w:r>
+          </w:p>
+        </w:tc>
+      </w:tr>
+      <w:tr>
+        <w:tc>
+          <w:tcPr>
+            <w:tcW w:type="dxa" w:w="1500"/>
+            <w:shd w:fill="F2F2F2" w:color="auto" w:val="clear"/>
+          </w:tcPr>
+          <w:p>
+            <w:r>
+              <w:rPr>
+                <w:rFonts w:ascii="Times New Roman" w:cs="Times New Roman" w:eastAsia="Times New Roman" w:hAnsi="Times New Roman"/>
+                <w:sz w:val="18"/>
+                <w:szCs w:val="18"/>
+              </w:rPr>
+              <w:t>Phi-4</w:t>
+            </w:r>
+          </w:p>
+        </w:tc>
+        <w:tc>
+          <w:tcPr>
+            <w:tcW w:type="dxa" w:w="1700"/>
+            <w:shd w:fill="F2F2F2" w:color="auto" w:val="clear"/>
+          </w:tcPr>
+          <w:p>
+            <w:r>
+              <w:rPr>
+                <w:rFonts w:ascii="Times New Roman" w:cs="Times New Roman" w:eastAsia="Times New Roman" w:hAnsi="Times New Roman"/>
+                <w:sz w:val="18"/>
+                <w:szCs w:val="18"/>
+              </w:rPr>
+              <w:t>microsoft/phi-4</w:t>
+            </w:r>
+          </w:p>
+        </w:tc>
+        <w:tc>
+          <w:tcPr>
+            <w:tcW w:type="dxa" w:w="1150"/>
+            <w:shd w:fill="F2F2F2" w:color="auto" w:val="clear"/>
+          </w:tcPr>
+          <w:p>
+            <w:r>
+              <w:rPr>
+                <w:rFonts w:ascii="Times New Roman" w:cs="Times New Roman" w:eastAsia="Times New Roman" w:hAnsi="Times New Roman"/>
+                <w:sz w:val="18"/>
+                <w:szCs w:val="18"/>
+              </w:rPr>
+              <w:t xml:space="preserve">Microsoft (OpenRouter, free tier)</w:t>
+            </w:r>
+          </w:p>
+        </w:tc>
+        <w:tc>
+          <w:tcPr>
+            <w:tcW w:type="dxa" w:w="900"/>
+            <w:shd w:fill="F2F2F2" w:color="auto" w:val="clear"/>
+          </w:tcPr>
+          <w:p>
+            <w:r>
+              <w:rPr>
+                <w:rFonts w:ascii="Times New Roman" w:cs="Times New Roman" w:eastAsia="Times New Roman" w:hAnsi="Times New Roman"/>
+                <w:sz w:val="18"/>
+                <w:szCs w:val="18"/>
+              </w:rPr>
+              <w:t>16,384</w:t>
+            </w:r>
+          </w:p>
+        </w:tc>
+        <w:tc>
+          <w:tcPr>
+            <w:tcW w:type="dxa" w:w="1100"/>
+            <w:shd w:fill="F2F2F2" w:color="auto" w:val="clear"/>
+          </w:tcPr>
+          <w:p>
+            <w:r>
+              <w:rPr>
+                <w:rFonts w:ascii="Times New Roman" w:cs="Times New Roman" w:eastAsia="Times New Roman" w:hAnsi="Times New Roman"/>
+                <w:sz w:val="18"/>
+                <w:szCs w:val="18"/>
+              </w:rPr>
+              <w:t xml:space="preserve">Jun 2024</w:t>
+            </w:r>
+          </w:p>
+        </w:tc>
+        <w:tc>
+          <w:tcPr>
+            <w:tcW w:type="dxa" w:w="900"/>
+            <w:shd w:fill="F2F2F2" w:color="auto" w:val="clear"/>
+          </w:tcPr>
+          <w:p>
+            <w:r>
+              <w:rPr>
+                <w:rFonts w:ascii="Times New Roman" w:cs="Times New Roman" w:eastAsia="Times New Roman" w:hAnsi="Times New Roman"/>
+                <w:sz w:val="18"/>
+                <w:szCs w:val="18"/>
+              </w:rPr>
+              <w:t>1.0</w:t>
+            </w:r>
+          </w:p>
+        </w:tc>
+        <w:tc>
+          <w:tcPr>
+            <w:tcW w:type="dxa" w:w="750"/>
+            <w:shd w:fill="F2F2F2" w:color="auto" w:val="clear"/>
+          </w:tcPr>
+          <w:p>
+            <w:r>
+              <w:rPr>
+                <w:rFonts w:ascii="Times New Roman" w:cs="Times New Roman" w:eastAsia="Times New Roman" w:hAnsi="Times New Roman"/>
+                <w:sz w:val="18"/>
+                <w:szCs w:val="18"/>
+              </w:rPr>
+              <w:t>42</w:t>
             </w:r>
           </w:p>
         </w:tc>
         <w:tc>
           <w:tcPr>
             <w:tcW w:type="dxa" w:w="920"/>
-            <w:shd w:fill="FFFFFF" w:color="auto" w:val="clear"/>
-          </w:tcPr>
-          <w:p>
-            <w:r>
-              <w:rPr>
-                <w:rFonts w:ascii="Times New Roman" w:cs="Times New Roman" w:eastAsia="Times New Roman" w:hAnsi="Times New Roman"/>
-                <w:sz w:val="18"/>
-                <w:szCs w:val="18"/>
-              </w:rPr>
-              <w:t xml:space="preserve">0.0</w:t>
+            <w:shd w:fill="F2F2F2" w:color="auto" w:val="clear"/>
+          </w:tcPr>
+          <w:p>
+            <w:r>
+              <w:rPr>
+                <w:rFonts w:ascii="Times New Roman" w:cs="Times New Roman" w:eastAsia="Times New Roman" w:hAnsi="Times New Roman"/>
+                <w:sz w:val="18"/>
+                <w:szCs w:val="18"/>
+              </w:rPr>
+              <w:t>16,384</w:t>
             </w:r>
           </w:p>
         </w:tc>
@@ -2808,15 +2796,7 @@
           <w:sz w:val="22"/>
           <w:szCs w:val="22"/>
         </w:rPr>
-        <w:t xml:space="preserve">* Knowledge cutoff: </w:t>
-      </w:r>
-      <w:r>
-        <w:rPr>
-          <w:rFonts w:ascii="Times New Roman" w:cs="Times New Roman" w:eastAsia="Times New Roman" w:hAnsi="Times New Roman"/>
-          <w:sz w:val="22"/>
-          <w:szCs w:val="22"/>
-        </w:rPr>
-        <w:t xml:space="preserve">Dates marked with * are approximate; provider documentation should be consulted for exact cutoffs.</w:t>
+        <w:t xml:space="preserve">Knowledge cutoff: Dates are approximate; consult provider documentation for exact cutoffs. Mistral Small 4 cutoff is not publicly documented by Mistral AI.</w:t>
       </w:r>
     </w:p>
     <w:p>
@@ -2852,7 +2832,7 @@
           <w:sz w:val="22"/>
           <w:szCs w:val="22"/>
         </w:rPr>
-        <w:t xml:space="preserve">Additional configuration applied uniformly: max_tokens = 512; seed = 42 (best-effort; provider support varies). No system-prompt overrides are applied beyond the agent-specific prompts defined in the AnxioSense pipeline.</w:t>
+        <w:t xml:space="preserve">Additional configuration applied uniformly: Maximum output tokens and random seed are specified per model in the table above (best-effort; provider support for seed varies). No system-prompt overrides are applied beyond the agent-specific prompts defined in the AnxioSense pipeline.</w:t>
       </w:r>
     </w:p>
     <w:p>
@@ -3287,7 +3267,7 @@
           <w:sz w:val="22"/>
           <w:szCs w:val="22"/>
         </w:rPr>
-        <w:t xml:space="preserve">Large language models produce stochastic outputs due to nucleus sampling, even at low temperatures. Five repeated runs are the minimum accepted practice in the LLM evaluation literature (Liang et al., 2022, HELM benchmark). They provide sufficient samples to compute mean and standard deviation per configuration, identify unstable prompts (high standard deviation is diagnostic of a prompt engineering problem), and support paired statistical tests between configurations. More runs would improve power but are constrained by Groq API rate limits.</w:t>
+        <w:t xml:space="preserve">Large language models produce stochastic outputs due to nucleus sampling, even at low temperatures. Five repeated runs are the minimum accepted practice in the LLM evaluation literature (Liang et al., 2023, HELM benchmark). They provide sufficient samples to compute mean and standard deviation per configuration, identify unstable prompts (high standard deviation is diagnostic of a prompt engineering problem), and support paired statistical tests between configurations. More runs would improve power but are constrained by Groq API rate limits.</w:t>
       </w:r>
     </w:p>
     <w:p>
@@ -3370,7 +3350,7 @@
           <w:sz w:val="22"/>
           <w:szCs w:val="22"/>
         </w:rPr>
-        <w:t xml:space="preserve">Full pipeline (top LLM, 1S-CoT) on both Dreaddit and ANGST. Assesses dataset-level variation in system behaviour.</w:t>
+        <w:t xml:space="preserve">Full pipeline (top LLM, 1S-CoT) on both Dreaddit and GoEmotions. Assesses dataset-level variation in system behaviour.</w:t>
       </w:r>
     </w:p>
     <w:p>
@@ -3671,7 +3651,7 @@
                 <w:sz w:val="18"/>
                 <w:szCs w:val="18"/>
               </w:rPr>
-              <w:t xml:space="preserve">Resolved. Dreaddit (CLPsych 2019) and ANGST (EMNLP 2024) selected. See Section 3.</w:t>
+              <w:t xml:space="preserve">Resolved. Dreaddit (LOUHI Workshop @ EMNLP 2019) and GoEmotions (ACL 2020) selected. Dreaddit evaluates end-to-end referral classification; GoEmotions evaluates the Emotion Analysis Agent. See Section 3.</w:t>
             </w:r>
           </w:p>
         </w:tc>
@@ -3875,7 +3855,7 @@
                 <w:sz w:val="18"/>
                 <w:szCs w:val="18"/>
               </w:rPr>
-              <w:t xml:space="preserve">Resolved. Dreaddit (CLPsych 2019, NAACL co-located) and ANGST (EMNLP 2024) both satisfy the top-tier venue requirement.</w:t>
+              <w:t xml:space="preserve">Resolved. Dreaddit (LOUHI Workshop @ EMNLP 2019, EMNLP co-located) and GoEmotions (ACL 2020) both satisfy the top-tier venue requirement. See Section 3.</w:t>
             </w:r>
           </w:p>
         </w:tc>
@@ -3902,20 +3882,10 @@
       <w:r>
         <w:rPr>
           <w:rFonts w:ascii="Times New Roman" w:cs="Times New Roman" w:eastAsia="Times New Roman" w:hAnsi="Times New Roman"/>
-          <w:b/>
-          <w:bCs/>
-          <w:sz w:val="22"/>
-          <w:szCs w:val="22"/>
-        </w:rPr>
-        <w:t xml:space="preserve">ANGST access: </w:t>
-      </w:r>
-      <w:r>
-        <w:rPr>
-          <w:rFonts w:ascii="Times New Roman" w:cs="Times New Roman" w:eastAsia="Times New Roman" w:hAnsi="Times New Roman"/>
-          <w:sz w:val="22"/>
-          <w:szCs w:val="22"/>
-        </w:rPr>
-        <w:t xml:space="preserve">ANGST (Hengle et al., EMNLP 2024) is distributed via HuggingFace (ameyhengle/ANGST) and requires completing a Google Form before access is granted. Submit the request early; approval typically takes 24–48 hours.</w:t>
+          <w:sz w:val="22"/>
+          <w:szCs w:val="22"/>
+        </w:rPr>
+        <w:t xml:space="preserve">GoEmotions access: GoEmotions (Demszky et al., ACL 2020) is publicly available on Kaggle (debarshichanda/goemotions) and Google Cloud Storage (gs://gresearch/goemotions/data/) without access restrictions.</w:t>
       </w:r>
     </w:p>
     <w:p>

</xml_diff>